<commit_message>
Adiciona capítulo Glossário e Siglas ao Product Report do JourneyGraph
Último capítulo do documento, em ordem alfabética: 38 termos cobrindo
indicadores (IQRE_ISP, Sigma Topológico, Churn Signal, VAMPING etc.),
siglas (ARPU, FCAPS, RADIUS, IPFIX, SVA, LGPD...), modelos/técnicas
(K-Means++, JSD, Markov, Bayes, Brandes, PageRank, HHI) e normas
(eTOM, ITU-T, TM Forum) — todos verificados contra journeygraph/index.html
e o texto já existente do documento, sem duplicar as fórmulas já
detalhadas no catálogo de indicadores (§2.6).
</commit_message>
<xml_diff>
--- a/docs/produtos/journeygraph-product-report.docx
+++ b/docs/produtos/journeygraph-product-report.docx
@@ -447,6 +447,31 @@
           <w:szCs w:val="22"/>
         </w:rPr>
         <w:t xml:space="preserve">	18</w:t>
+      </w:r>
+    </w:p>
+    <w:p>
+      <w:pPr>
+        <w:tabs>
+          <w:tab w:val="right" w:pos="9026" w:leader="dot"/>
+        </w:tabs>
+        <w:spacing w:after="100"/>
+        <w:ind w:left="0"/>
+      </w:pPr>
+      <w:r>
+        <w:rPr>
+          <w:b/>
+          <w:bCs/>
+          <w:sz w:val="22"/>
+          <w:szCs w:val="22"/>
+        </w:rPr>
+        <w:t xml:space="preserve">Glossário e Siglas</w:t>
+      </w:r>
+      <w:r>
+        <w:rPr>
+          <w:sz w:val="22"/>
+          <w:szCs w:val="22"/>
+        </w:rPr>
+        <w:t xml:space="preserve">	19</w:t>
       </w:r>
     </w:p>
     <w:p>
@@ -14339,6 +14364,4162 @@
         </w:tc>
       </w:tr>
     </w:tbl>
+    <w:p>
+      <w:pPr>
+        <w:pStyle w:val="Heading1"/>
+      </w:pPr>
+      <w:r>
+        <w:t xml:space="preserve">Glossário e Siglas</w:t>
+      </w:r>
+    </w:p>
+    <w:p>
+      <w:pPr>
+        <w:spacing w:after="200" w:before="0"/>
+        <w:jc w:val="both"/>
+      </w:pPr>
+      <w:r>
+        <w:rPr>
+          <w:b w:val="false"/>
+          <w:bCs w:val="false"/>
+          <w:i w:val="false"/>
+          <w:iCs w:val="false"/>
+        </w:rPr>
+        <w:t xml:space="preserve">Consolida, em ordem alfabética, os indicadores, siglas, modelos e frameworks setoriais efetivamente usados neste documento e no corpus técnico do JourneyGraph — cada indicador da família Saúde Digital já detalhado com fórmula em §2.6 aparece aqui apenas com a definição de uma linha, sem repetir a regra de cálculo.</w:t>
+      </w:r>
+    </w:p>
+    <w:tbl>
+      <w:tblPr>
+        <w:tblW w:type="dxa" w:w="9360"/>
+        <w:tblBorders>
+          <w:top w:val="single" w:color="auto" w:sz="4"/>
+          <w:left w:val="single" w:color="auto" w:sz="4"/>
+          <w:bottom w:val="single" w:color="auto" w:sz="4"/>
+          <w:right w:val="single" w:color="auto" w:sz="4"/>
+          <w:insideH w:val="single" w:color="auto" w:sz="4"/>
+          <w:insideV w:val="single" w:color="auto" w:sz="4"/>
+        </w:tblBorders>
+      </w:tblPr>
+      <w:tblGrid>
+        <w:gridCol w:w="2100"/>
+        <w:gridCol w:w="1500"/>
+        <w:gridCol w:w="5760"/>
+      </w:tblGrid>
+      <w:tr>
+        <w:tc>
+          <w:tcPr>
+            <w:tcW w:type="dxa" w:w="2100"/>
+            <w:tcBorders>
+              <w:top w:val="single" w:color="CCCCCC" w:sz="4"/>
+              <w:left w:val="single" w:color="CCCCCC" w:sz="4"/>
+              <w:bottom w:val="single" w:color="CCCCCC" w:sz="4"/>
+              <w:right w:val="single" w:color="CCCCCC" w:sz="4"/>
+            </w:tcBorders>
+            <w:shd w:fill="1F4E79" w:val="clear"/>
+            <w:tcMar>
+              <w:top w:type="dxa" w:w="100"/>
+              <w:left w:type="dxa" w:w="120"/>
+              <w:bottom w:type="dxa" w:w="100"/>
+              <w:right w:type="dxa" w:w="120"/>
+            </w:tcMar>
+            <w:vAlign w:val="center"/>
+          </w:tcPr>
+          <w:p>
+            <w:pPr>
+              <w:jc w:val="left"/>
+            </w:pPr>
+            <w:r>
+              <w:rPr>
+                <w:b/>
+                <w:bCs/>
+                <w:i w:val="false"/>
+                <w:iCs w:val="false"/>
+                <w:color w:val="FFFFFF"/>
+                <w:sz w:val="19"/>
+                <w:szCs w:val="19"/>
+              </w:rPr>
+              <w:t xml:space="preserve">Termo</w:t>
+            </w:r>
+          </w:p>
+        </w:tc>
+        <w:tc>
+          <w:tcPr>
+            <w:tcW w:type="dxa" w:w="1500"/>
+            <w:tcBorders>
+              <w:top w:val="single" w:color="CCCCCC" w:sz="4"/>
+              <w:left w:val="single" w:color="CCCCCC" w:sz="4"/>
+              <w:bottom w:val="single" w:color="CCCCCC" w:sz="4"/>
+              <w:right w:val="single" w:color="CCCCCC" w:sz="4"/>
+            </w:tcBorders>
+            <w:shd w:fill="1F4E79" w:val="clear"/>
+            <w:tcMar>
+              <w:top w:type="dxa" w:w="100"/>
+              <w:left w:type="dxa" w:w="120"/>
+              <w:bottom w:type="dxa" w:w="100"/>
+              <w:right w:type="dxa" w:w="120"/>
+            </w:tcMar>
+            <w:vAlign w:val="center"/>
+          </w:tcPr>
+          <w:p>
+            <w:pPr>
+              <w:jc w:val="left"/>
+            </w:pPr>
+            <w:r>
+              <w:rPr>
+                <w:b/>
+                <w:bCs/>
+                <w:i w:val="false"/>
+                <w:iCs w:val="false"/>
+                <w:color w:val="FFFFFF"/>
+                <w:sz w:val="19"/>
+                <w:szCs w:val="19"/>
+              </w:rPr>
+              <w:t xml:space="preserve">Categoria</w:t>
+            </w:r>
+          </w:p>
+        </w:tc>
+        <w:tc>
+          <w:tcPr>
+            <w:tcW w:type="dxa" w:w="5760"/>
+            <w:tcBorders>
+              <w:top w:val="single" w:color="CCCCCC" w:sz="4"/>
+              <w:left w:val="single" w:color="CCCCCC" w:sz="4"/>
+              <w:bottom w:val="single" w:color="CCCCCC" w:sz="4"/>
+              <w:right w:val="single" w:color="CCCCCC" w:sz="4"/>
+            </w:tcBorders>
+            <w:shd w:fill="1F4E79" w:val="clear"/>
+            <w:tcMar>
+              <w:top w:type="dxa" w:w="100"/>
+              <w:left w:type="dxa" w:w="120"/>
+              <w:bottom w:type="dxa" w:w="100"/>
+              <w:right w:type="dxa" w:w="120"/>
+            </w:tcMar>
+            <w:vAlign w:val="center"/>
+          </w:tcPr>
+          <w:p>
+            <w:pPr>
+              <w:jc w:val="left"/>
+            </w:pPr>
+            <w:r>
+              <w:rPr>
+                <w:b/>
+                <w:bCs/>
+                <w:i w:val="false"/>
+                <w:iCs w:val="false"/>
+                <w:color w:val="FFFFFF"/>
+                <w:sz w:val="19"/>
+                <w:szCs w:val="19"/>
+              </w:rPr>
+              <w:t xml:space="preserve">Definição</w:t>
+            </w:r>
+          </w:p>
+        </w:tc>
+      </w:tr>
+      <w:tr>
+        <w:tc>
+          <w:tcPr>
+            <w:tcW w:type="dxa" w:w="2100"/>
+            <w:tcBorders>
+              <w:top w:val="single" w:color="CCCCCC" w:sz="4"/>
+              <w:left w:val="single" w:color="CCCCCC" w:sz="4"/>
+              <w:bottom w:val="single" w:color="CCCCCC" w:sz="4"/>
+              <w:right w:val="single" w:color="CCCCCC" w:sz="4"/>
+            </w:tcBorders>
+            <w:tcMar>
+              <w:top w:type="dxa" w:w="100"/>
+              <w:left w:type="dxa" w:w="120"/>
+              <w:bottom w:type="dxa" w:w="100"/>
+              <w:right w:type="dxa" w:w="120"/>
+            </w:tcMar>
+            <w:vAlign w:val="center"/>
+          </w:tcPr>
+          <w:p>
+            <w:pPr>
+              <w:jc w:val="left"/>
+            </w:pPr>
+            <w:r>
+              <w:rPr>
+                <w:b/>
+                <w:bCs/>
+                <w:i w:val="false"/>
+                <w:iCs w:val="false"/>
+                <w:sz w:val="19"/>
+                <w:szCs w:val="19"/>
+              </w:rPr>
+              <w:t xml:space="preserve">ARPU</w:t>
+            </w:r>
+          </w:p>
+        </w:tc>
+        <w:tc>
+          <w:tcPr>
+            <w:tcW w:type="dxa" w:w="1500"/>
+            <w:tcBorders>
+              <w:top w:val="single" w:color="CCCCCC" w:sz="4"/>
+              <w:left w:val="single" w:color="CCCCCC" w:sz="4"/>
+              <w:bottom w:val="single" w:color="CCCCCC" w:sz="4"/>
+              <w:right w:val="single" w:color="CCCCCC" w:sz="4"/>
+            </w:tcBorders>
+            <w:tcMar>
+              <w:top w:type="dxa" w:w="100"/>
+              <w:left w:type="dxa" w:w="120"/>
+              <w:bottom w:type="dxa" w:w="100"/>
+              <w:right w:type="dxa" w:w="120"/>
+            </w:tcMar>
+            <w:vAlign w:val="center"/>
+          </w:tcPr>
+          <w:p>
+            <w:pPr>
+              <w:jc w:val="left"/>
+            </w:pPr>
+            <w:r>
+              <w:rPr>
+                <w:b w:val="false"/>
+                <w:bCs w:val="false"/>
+                <w:i w:val="false"/>
+                <w:iCs w:val="false"/>
+                <w:color w:val="4A6A8A"/>
+                <w:sz w:val="19"/>
+                <w:szCs w:val="19"/>
+              </w:rPr>
+              <w:t xml:space="preserve">Sigla</w:t>
+            </w:r>
+          </w:p>
+        </w:tc>
+        <w:tc>
+          <w:tcPr>
+            <w:tcW w:type="dxa" w:w="5760"/>
+            <w:tcBorders>
+              <w:top w:val="single" w:color="CCCCCC" w:sz="4"/>
+              <w:left w:val="single" w:color="CCCCCC" w:sz="4"/>
+              <w:bottom w:val="single" w:color="CCCCCC" w:sz="4"/>
+              <w:right w:val="single" w:color="CCCCCC" w:sz="4"/>
+            </w:tcBorders>
+            <w:tcMar>
+              <w:top w:type="dxa" w:w="100"/>
+              <w:left w:type="dxa" w:w="120"/>
+              <w:bottom w:type="dxa" w:w="100"/>
+              <w:right w:type="dxa" w:w="120"/>
+            </w:tcMar>
+            <w:vAlign w:val="center"/>
+          </w:tcPr>
+          <w:p>
+            <w:pPr>
+              <w:jc w:val="left"/>
+            </w:pPr>
+            <w:r>
+              <w:rPr>
+                <w:b w:val="false"/>
+                <w:bCs w:val="false"/>
+                <w:i w:val="false"/>
+                <w:iCs w:val="false"/>
+                <w:sz w:val="19"/>
+                <w:szCs w:val="19"/>
+              </w:rPr>
+              <w:t xml:space="preserve">Average Revenue Per User — receita média por usuário; pondera o Churn Signal (log(ARPU)) e classifica oportunidades de Upsell Score.</w:t>
+            </w:r>
+          </w:p>
+        </w:tc>
+      </w:tr>
+      <w:tr>
+        <w:tc>
+          <w:tcPr>
+            <w:tcW w:type="dxa" w:w="2100"/>
+            <w:tcBorders>
+              <w:top w:val="single" w:color="CCCCCC" w:sz="4"/>
+              <w:left w:val="single" w:color="CCCCCC" w:sz="4"/>
+              <w:bottom w:val="single" w:color="CCCCCC" w:sz="4"/>
+              <w:right w:val="single" w:color="CCCCCC" w:sz="4"/>
+            </w:tcBorders>
+            <w:tcMar>
+              <w:top w:type="dxa" w:w="100"/>
+              <w:left w:type="dxa" w:w="120"/>
+              <w:bottom w:type="dxa" w:w="100"/>
+              <w:right w:type="dxa" w:w="120"/>
+            </w:tcMar>
+            <w:vAlign w:val="center"/>
+          </w:tcPr>
+          <w:p>
+            <w:pPr>
+              <w:jc w:val="left"/>
+            </w:pPr>
+            <w:r>
+              <w:rPr>
+                <w:b/>
+                <w:bCs/>
+                <w:i w:val="false"/>
+                <w:iCs w:val="false"/>
+                <w:sz w:val="19"/>
+                <w:szCs w:val="19"/>
+              </w:rPr>
+              <w:t xml:space="preserve">Bayes (Rede Bayesiana)</w:t>
+            </w:r>
+          </w:p>
+        </w:tc>
+        <w:tc>
+          <w:tcPr>
+            <w:tcW w:type="dxa" w:w="1500"/>
+            <w:tcBorders>
+              <w:top w:val="single" w:color="CCCCCC" w:sz="4"/>
+              <w:left w:val="single" w:color="CCCCCC" w:sz="4"/>
+              <w:bottom w:val="single" w:color="CCCCCC" w:sz="4"/>
+              <w:right w:val="single" w:color="CCCCCC" w:sz="4"/>
+            </w:tcBorders>
+            <w:tcMar>
+              <w:top w:type="dxa" w:w="100"/>
+              <w:left w:type="dxa" w:w="120"/>
+              <w:bottom w:type="dxa" w:w="100"/>
+              <w:right w:type="dxa" w:w="120"/>
+            </w:tcMar>
+            <w:vAlign w:val="center"/>
+          </w:tcPr>
+          <w:p>
+            <w:pPr>
+              <w:jc w:val="left"/>
+            </w:pPr>
+            <w:r>
+              <w:rPr>
+                <w:b w:val="false"/>
+                <w:bCs w:val="false"/>
+                <w:i w:val="false"/>
+                <w:iCs w:val="false"/>
+                <w:color w:val="4A6A8A"/>
+                <w:sz w:val="19"/>
+                <w:szCs w:val="19"/>
+              </w:rPr>
+              <w:t xml:space="preserve">Modelo/Técnica</w:t>
+            </w:r>
+          </w:p>
+        </w:tc>
+        <w:tc>
+          <w:tcPr>
+            <w:tcW w:type="dxa" w:w="5760"/>
+            <w:tcBorders>
+              <w:top w:val="single" w:color="CCCCCC" w:sz="4"/>
+              <w:left w:val="single" w:color="CCCCCC" w:sz="4"/>
+              <w:bottom w:val="single" w:color="CCCCCC" w:sz="4"/>
+              <w:right w:val="single" w:color="CCCCCC" w:sz="4"/>
+            </w:tcBorders>
+            <w:tcMar>
+              <w:top w:type="dxa" w:w="100"/>
+              <w:left w:type="dxa" w:w="120"/>
+              <w:bottom w:type="dxa" w:w="100"/>
+              <w:right w:type="dxa" w:w="120"/>
+            </w:tcMar>
+            <w:vAlign w:val="center"/>
+          </w:tcPr>
+          <w:p>
+            <w:pPr>
+              <w:jc w:val="left"/>
+            </w:pPr>
+            <w:r>
+              <w:rPr>
+                <w:b w:val="false"/>
+                <w:bCs w:val="false"/>
+                <w:i w:val="false"/>
+                <w:iCs w:val="false"/>
+                <w:sz w:val="19"/>
+                <w:szCs w:val="19"/>
+              </w:rPr>
+              <w:t xml:space="preserve">Rede Bayesiana simplificada com posterior real sobre causas candidatas concorrentes; base da Causa Provável do Painel de Alertas, real desde 02/08/2026, calculada por persona (não por assinante individual).</w:t>
+            </w:r>
+          </w:p>
+        </w:tc>
+      </w:tr>
+      <w:tr>
+        <w:tc>
+          <w:tcPr>
+            <w:tcW w:type="dxa" w:w="2100"/>
+            <w:tcBorders>
+              <w:top w:val="single" w:color="CCCCCC" w:sz="4"/>
+              <w:left w:val="single" w:color="CCCCCC" w:sz="4"/>
+              <w:bottom w:val="single" w:color="CCCCCC" w:sz="4"/>
+              <w:right w:val="single" w:color="CCCCCC" w:sz="4"/>
+            </w:tcBorders>
+            <w:tcMar>
+              <w:top w:type="dxa" w:w="100"/>
+              <w:left w:type="dxa" w:w="120"/>
+              <w:bottom w:type="dxa" w:w="100"/>
+              <w:right w:type="dxa" w:w="120"/>
+            </w:tcMar>
+            <w:vAlign w:val="center"/>
+          </w:tcPr>
+          <w:p>
+            <w:pPr>
+              <w:jc w:val="left"/>
+            </w:pPr>
+            <w:r>
+              <w:rPr>
+                <w:b/>
+                <w:bCs/>
+                <w:i w:val="false"/>
+                <w:iCs w:val="false"/>
+                <w:sz w:val="19"/>
+                <w:szCs w:val="19"/>
+              </w:rPr>
+              <w:t xml:space="preserve">Binge Watching</w:t>
+            </w:r>
+          </w:p>
+        </w:tc>
+        <w:tc>
+          <w:tcPr>
+            <w:tcW w:type="dxa" w:w="1500"/>
+            <w:tcBorders>
+              <w:top w:val="single" w:color="CCCCCC" w:sz="4"/>
+              <w:left w:val="single" w:color="CCCCCC" w:sz="4"/>
+              <w:bottom w:val="single" w:color="CCCCCC" w:sz="4"/>
+              <w:right w:val="single" w:color="CCCCCC" w:sz="4"/>
+            </w:tcBorders>
+            <w:tcMar>
+              <w:top w:type="dxa" w:w="100"/>
+              <w:left w:type="dxa" w:w="120"/>
+              <w:bottom w:type="dxa" w:w="100"/>
+              <w:right w:type="dxa" w:w="120"/>
+            </w:tcMar>
+            <w:vAlign w:val="center"/>
+          </w:tcPr>
+          <w:p>
+            <w:pPr>
+              <w:jc w:val="left"/>
+            </w:pPr>
+            <w:r>
+              <w:rPr>
+                <w:b w:val="false"/>
+                <w:bCs w:val="false"/>
+                <w:i w:val="false"/>
+                <w:iCs w:val="false"/>
+                <w:color w:val="4A6A8A"/>
+                <w:sz w:val="19"/>
+                <w:szCs w:val="19"/>
+              </w:rPr>
+              <w:t xml:space="preserve">Indicador</w:t>
+            </w:r>
+          </w:p>
+        </w:tc>
+        <w:tc>
+          <w:tcPr>
+            <w:tcW w:type="dxa" w:w="5760"/>
+            <w:tcBorders>
+              <w:top w:val="single" w:color="CCCCCC" w:sz="4"/>
+              <w:left w:val="single" w:color="CCCCCC" w:sz="4"/>
+              <w:bottom w:val="single" w:color="CCCCCC" w:sz="4"/>
+              <w:right w:val="single" w:color="CCCCCC" w:sz="4"/>
+            </w:tcBorders>
+            <w:tcMar>
+              <w:top w:type="dxa" w:w="100"/>
+              <w:left w:type="dxa" w:w="120"/>
+              <w:bottom w:type="dxa" w:w="100"/>
+              <w:right w:type="dxa" w:w="120"/>
+            </w:tcMar>
+            <w:vAlign w:val="center"/>
+          </w:tcPr>
+          <w:p>
+            <w:pPr>
+              <w:jc w:val="left"/>
+            </w:pPr>
+            <w:r>
+              <w:rPr>
+                <w:b w:val="false"/>
+                <w:bCs w:val="false"/>
+                <w:i w:val="false"/>
+                <w:iCs w:val="false"/>
+                <w:sz w:val="19"/>
+                <w:szCs w:val="19"/>
+              </w:rPr>
+              <w:t xml:space="preserve">Sessões longas concentradas em entretenimento (streaming/gaming): 50% duração acima do típico + 50% % streaming+gaming, normalizado por percentil.</w:t>
+            </w:r>
+          </w:p>
+        </w:tc>
+      </w:tr>
+      <w:tr>
+        <w:tc>
+          <w:tcPr>
+            <w:tcW w:type="dxa" w:w="2100"/>
+            <w:tcBorders>
+              <w:top w:val="single" w:color="CCCCCC" w:sz="4"/>
+              <w:left w:val="single" w:color="CCCCCC" w:sz="4"/>
+              <w:bottom w:val="single" w:color="CCCCCC" w:sz="4"/>
+              <w:right w:val="single" w:color="CCCCCC" w:sz="4"/>
+            </w:tcBorders>
+            <w:tcMar>
+              <w:top w:type="dxa" w:w="100"/>
+              <w:left w:type="dxa" w:w="120"/>
+              <w:bottom w:type="dxa" w:w="100"/>
+              <w:right w:type="dxa" w:w="120"/>
+            </w:tcMar>
+            <w:vAlign w:val="center"/>
+          </w:tcPr>
+          <w:p>
+            <w:pPr>
+              <w:jc w:val="left"/>
+            </w:pPr>
+            <w:r>
+              <w:rPr>
+                <w:b/>
+                <w:bCs/>
+                <w:i w:val="false"/>
+                <w:iCs w:val="false"/>
+                <w:sz w:val="19"/>
+                <w:szCs w:val="19"/>
+              </w:rPr>
+              <w:t xml:space="preserve">Busy Hour</w:t>
+            </w:r>
+          </w:p>
+        </w:tc>
+        <w:tc>
+          <w:tcPr>
+            <w:tcW w:type="dxa" w:w="1500"/>
+            <w:tcBorders>
+              <w:top w:val="single" w:color="CCCCCC" w:sz="4"/>
+              <w:left w:val="single" w:color="CCCCCC" w:sz="4"/>
+              <w:bottom w:val="single" w:color="CCCCCC" w:sz="4"/>
+              <w:right w:val="single" w:color="CCCCCC" w:sz="4"/>
+            </w:tcBorders>
+            <w:tcMar>
+              <w:top w:type="dxa" w:w="100"/>
+              <w:left w:type="dxa" w:w="120"/>
+              <w:bottom w:type="dxa" w:w="100"/>
+              <w:right w:type="dxa" w:w="120"/>
+            </w:tcMar>
+            <w:vAlign w:val="center"/>
+          </w:tcPr>
+          <w:p>
+            <w:pPr>
+              <w:jc w:val="left"/>
+            </w:pPr>
+            <w:r>
+              <w:rPr>
+                <w:b w:val="false"/>
+                <w:bCs w:val="false"/>
+                <w:i w:val="false"/>
+                <w:iCs w:val="false"/>
+                <w:color w:val="4A6A8A"/>
+                <w:sz w:val="19"/>
+                <w:szCs w:val="19"/>
+              </w:rPr>
+              <w:t xml:space="preserve">Indicador</w:t>
+            </w:r>
+          </w:p>
+        </w:tc>
+        <w:tc>
+          <w:tcPr>
+            <w:tcW w:type="dxa" w:w="5760"/>
+            <w:tcBorders>
+              <w:top w:val="single" w:color="CCCCCC" w:sz="4"/>
+              <w:left w:val="single" w:color="CCCCCC" w:sz="4"/>
+              <w:bottom w:val="single" w:color="CCCCCC" w:sz="4"/>
+              <w:right w:val="single" w:color="CCCCCC" w:sz="4"/>
+            </w:tcBorders>
+            <w:tcMar>
+              <w:top w:type="dxa" w:w="100"/>
+              <w:left w:type="dxa" w:w="120"/>
+              <w:bottom w:type="dxa" w:w="100"/>
+              <w:right w:type="dxa" w:w="120"/>
+            </w:tcMar>
+            <w:vAlign w:val="center"/>
+          </w:tcPr>
+          <w:p>
+            <w:pPr>
+              <w:jc w:val="left"/>
+            </w:pPr>
+            <w:r>
+              <w:rPr>
+                <w:b w:val="false"/>
+                <w:bCs w:val="false"/>
+                <w:i w:val="false"/>
+                <w:iCs w:val="false"/>
+                <w:sz w:val="19"/>
+                <w:szCs w:val="19"/>
+              </w:rPr>
+              <w:t xml:space="preserve">Agregação de volume por hora/assinante/equipamento (peak_ratio); base do dimensionamento de CAPEX e do Congestionamento OLT.</w:t>
+            </w:r>
+          </w:p>
+        </w:tc>
+      </w:tr>
+      <w:tr>
+        <w:tc>
+          <w:tcPr>
+            <w:tcW w:type="dxa" w:w="2100"/>
+            <w:tcBorders>
+              <w:top w:val="single" w:color="CCCCCC" w:sz="4"/>
+              <w:left w:val="single" w:color="CCCCCC" w:sz="4"/>
+              <w:bottom w:val="single" w:color="CCCCCC" w:sz="4"/>
+              <w:right w:val="single" w:color="CCCCCC" w:sz="4"/>
+            </w:tcBorders>
+            <w:tcMar>
+              <w:top w:type="dxa" w:w="100"/>
+              <w:left w:type="dxa" w:w="120"/>
+              <w:bottom w:type="dxa" w:w="100"/>
+              <w:right w:type="dxa" w:w="120"/>
+            </w:tcMar>
+            <w:vAlign w:val="center"/>
+          </w:tcPr>
+          <w:p>
+            <w:pPr>
+              <w:jc w:val="left"/>
+            </w:pPr>
+            <w:r>
+              <w:rPr>
+                <w:b/>
+                <w:bCs/>
+                <w:i w:val="false"/>
+                <w:iCs w:val="false"/>
+                <w:sz w:val="19"/>
+                <w:szCs w:val="19"/>
+              </w:rPr>
+              <w:t xml:space="preserve">CDAR</w:t>
+            </w:r>
+          </w:p>
+        </w:tc>
+        <w:tc>
+          <w:tcPr>
+            <w:tcW w:type="dxa" w:w="1500"/>
+            <w:tcBorders>
+              <w:top w:val="single" w:color="CCCCCC" w:sz="4"/>
+              <w:left w:val="single" w:color="CCCCCC" w:sz="4"/>
+              <w:bottom w:val="single" w:color="CCCCCC" w:sz="4"/>
+              <w:right w:val="single" w:color="CCCCCC" w:sz="4"/>
+            </w:tcBorders>
+            <w:tcMar>
+              <w:top w:type="dxa" w:w="100"/>
+              <w:left w:type="dxa" w:w="120"/>
+              <w:bottom w:type="dxa" w:w="100"/>
+              <w:right w:type="dxa" w:w="120"/>
+            </w:tcMar>
+            <w:vAlign w:val="center"/>
+          </w:tcPr>
+          <w:p>
+            <w:pPr>
+              <w:jc w:val="left"/>
+            </w:pPr>
+            <w:r>
+              <w:rPr>
+                <w:b w:val="false"/>
+                <w:bCs w:val="false"/>
+                <w:i w:val="false"/>
+                <w:iCs w:val="false"/>
+                <w:color w:val="4A6A8A"/>
+                <w:sz w:val="19"/>
+                <w:szCs w:val="19"/>
+              </w:rPr>
+              <w:t xml:space="preserve">Indicador</w:t>
+            </w:r>
+          </w:p>
+        </w:tc>
+        <w:tc>
+          <w:tcPr>
+            <w:tcW w:type="dxa" w:w="5760"/>
+            <w:tcBorders>
+              <w:top w:val="single" w:color="CCCCCC" w:sz="4"/>
+              <w:left w:val="single" w:color="CCCCCC" w:sz="4"/>
+              <w:bottom w:val="single" w:color="CCCCCC" w:sz="4"/>
+              <w:right w:val="single" w:color="CCCCCC" w:sz="4"/>
+            </w:tcBorders>
+            <w:tcMar>
+              <w:top w:type="dxa" w:w="100"/>
+              <w:left w:type="dxa" w:w="120"/>
+              <w:bottom w:type="dxa" w:w="100"/>
+              <w:right w:type="dxa" w:w="120"/>
+            </w:tcMar>
+            <w:vAlign w:val="center"/>
+          </w:tcPr>
+          <w:p>
+            <w:pPr>
+              <w:jc w:val="left"/>
+            </w:pPr>
+            <w:r>
+              <w:rPr>
+                <w:b w:val="false"/>
+                <w:bCs w:val="false"/>
+                <w:i w:val="false"/>
+                <w:iCs w:val="false"/>
+                <w:sz w:val="19"/>
+                <w:szCs w:val="19"/>
+              </w:rPr>
+              <w:t xml:space="preserve">Coeficiente de Dependência de Atualização em Tempo Real — proporção de tráfego residencial em plataformas de feed contínuo/notificações push; presente só na versão narrativa do corpus (ver Ressalvas, duplicação de indicadores).</w:t>
+            </w:r>
+          </w:p>
+        </w:tc>
+      </w:tr>
+      <w:tr>
+        <w:tc>
+          <w:tcPr>
+            <w:tcW w:type="dxa" w:w="2100"/>
+            <w:tcBorders>
+              <w:top w:val="single" w:color="CCCCCC" w:sz="4"/>
+              <w:left w:val="single" w:color="CCCCCC" w:sz="4"/>
+              <w:bottom w:val="single" w:color="CCCCCC" w:sz="4"/>
+              <w:right w:val="single" w:color="CCCCCC" w:sz="4"/>
+            </w:tcBorders>
+            <w:tcMar>
+              <w:top w:type="dxa" w:w="100"/>
+              <w:left w:type="dxa" w:w="120"/>
+              <w:bottom w:type="dxa" w:w="100"/>
+              <w:right w:type="dxa" w:w="120"/>
+            </w:tcMar>
+            <w:vAlign w:val="center"/>
+          </w:tcPr>
+          <w:p>
+            <w:pPr>
+              <w:jc w:val="left"/>
+            </w:pPr>
+            <w:r>
+              <w:rPr>
+                <w:b/>
+                <w:bCs/>
+                <w:i w:val="false"/>
+                <w:iCs w:val="false"/>
+                <w:sz w:val="19"/>
+                <w:szCs w:val="19"/>
+              </w:rPr>
+              <w:t xml:space="preserve">CDR</w:t>
+            </w:r>
+          </w:p>
+        </w:tc>
+        <w:tc>
+          <w:tcPr>
+            <w:tcW w:type="dxa" w:w="1500"/>
+            <w:tcBorders>
+              <w:top w:val="single" w:color="CCCCCC" w:sz="4"/>
+              <w:left w:val="single" w:color="CCCCCC" w:sz="4"/>
+              <w:bottom w:val="single" w:color="CCCCCC" w:sz="4"/>
+              <w:right w:val="single" w:color="CCCCCC" w:sz="4"/>
+            </w:tcBorders>
+            <w:tcMar>
+              <w:top w:type="dxa" w:w="100"/>
+              <w:left w:type="dxa" w:w="120"/>
+              <w:bottom w:type="dxa" w:w="100"/>
+              <w:right w:type="dxa" w:w="120"/>
+            </w:tcMar>
+            <w:vAlign w:val="center"/>
+          </w:tcPr>
+          <w:p>
+            <w:pPr>
+              <w:jc w:val="left"/>
+            </w:pPr>
+            <w:r>
+              <w:rPr>
+                <w:b w:val="false"/>
+                <w:bCs w:val="false"/>
+                <w:i w:val="false"/>
+                <w:iCs w:val="false"/>
+                <w:color w:val="4A6A8A"/>
+                <w:sz w:val="19"/>
+                <w:szCs w:val="19"/>
+              </w:rPr>
+              <w:t xml:space="preserve">Sigla</w:t>
+            </w:r>
+          </w:p>
+        </w:tc>
+        <w:tc>
+          <w:tcPr>
+            <w:tcW w:type="dxa" w:w="5760"/>
+            <w:tcBorders>
+              <w:top w:val="single" w:color="CCCCCC" w:sz="4"/>
+              <w:left w:val="single" w:color="CCCCCC" w:sz="4"/>
+              <w:bottom w:val="single" w:color="CCCCCC" w:sz="4"/>
+              <w:right w:val="single" w:color="CCCCCC" w:sz="4"/>
+            </w:tcBorders>
+            <w:tcMar>
+              <w:top w:type="dxa" w:w="100"/>
+              <w:left w:type="dxa" w:w="120"/>
+              <w:bottom w:type="dxa" w:w="100"/>
+              <w:right w:type="dxa" w:w="120"/>
+            </w:tcMar>
+            <w:vAlign w:val="center"/>
+          </w:tcPr>
+          <w:p>
+            <w:pPr>
+              <w:jc w:val="left"/>
+            </w:pPr>
+            <w:r>
+              <w:rPr>
+                <w:b w:val="false"/>
+                <w:bCs w:val="false"/>
+                <w:i w:val="false"/>
+                <w:iCs w:val="false"/>
+                <w:sz w:val="19"/>
+                <w:szCs w:val="19"/>
+              </w:rPr>
+              <w:t xml:space="preserve">Call Detail Record — registro de chamada; citado como fonte de Cell ID que tornaria o indicador Isolamento Digital calculável (gap de dado, indisponível em IPFIX de banda larga fixa).</w:t>
+            </w:r>
+          </w:p>
+        </w:tc>
+      </w:tr>
+      <w:tr>
+        <w:tc>
+          <w:tcPr>
+            <w:tcW w:type="dxa" w:w="2100"/>
+            <w:tcBorders>
+              <w:top w:val="single" w:color="CCCCCC" w:sz="4"/>
+              <w:left w:val="single" w:color="CCCCCC" w:sz="4"/>
+              <w:bottom w:val="single" w:color="CCCCCC" w:sz="4"/>
+              <w:right w:val="single" w:color="CCCCCC" w:sz="4"/>
+            </w:tcBorders>
+            <w:tcMar>
+              <w:top w:type="dxa" w:w="100"/>
+              <w:left w:type="dxa" w:w="120"/>
+              <w:bottom w:type="dxa" w:w="100"/>
+              <w:right w:type="dxa" w:w="120"/>
+            </w:tcMar>
+            <w:vAlign w:val="center"/>
+          </w:tcPr>
+          <w:p>
+            <w:pPr>
+              <w:jc w:val="left"/>
+            </w:pPr>
+            <w:r>
+              <w:rPr>
+                <w:b/>
+                <w:bCs/>
+                <w:i w:val="false"/>
+                <w:iCs w:val="false"/>
+                <w:sz w:val="19"/>
+                <w:szCs w:val="19"/>
+              </w:rPr>
+              <w:t xml:space="preserve">Centralidade de Nós (Brandes)</w:t>
+            </w:r>
+          </w:p>
+        </w:tc>
+        <w:tc>
+          <w:tcPr>
+            <w:tcW w:type="dxa" w:w="1500"/>
+            <w:tcBorders>
+              <w:top w:val="single" w:color="CCCCCC" w:sz="4"/>
+              <w:left w:val="single" w:color="CCCCCC" w:sz="4"/>
+              <w:bottom w:val="single" w:color="CCCCCC" w:sz="4"/>
+              <w:right w:val="single" w:color="CCCCCC" w:sz="4"/>
+            </w:tcBorders>
+            <w:tcMar>
+              <w:top w:type="dxa" w:w="100"/>
+              <w:left w:type="dxa" w:w="120"/>
+              <w:bottom w:type="dxa" w:w="100"/>
+              <w:right w:type="dxa" w:w="120"/>
+            </w:tcMar>
+            <w:vAlign w:val="center"/>
+          </w:tcPr>
+          <w:p>
+            <w:pPr>
+              <w:jc w:val="left"/>
+            </w:pPr>
+            <w:r>
+              <w:rPr>
+                <w:b w:val="false"/>
+                <w:bCs w:val="false"/>
+                <w:i w:val="false"/>
+                <w:iCs w:val="false"/>
+                <w:color w:val="4A6A8A"/>
+                <w:sz w:val="19"/>
+                <w:szCs w:val="19"/>
+              </w:rPr>
+              <w:t xml:space="preserve">Modelo/Técnica</w:t>
+            </w:r>
+          </w:p>
+        </w:tc>
+        <w:tc>
+          <w:tcPr>
+            <w:tcW w:type="dxa" w:w="5760"/>
+            <w:tcBorders>
+              <w:top w:val="single" w:color="CCCCCC" w:sz="4"/>
+              <w:left w:val="single" w:color="CCCCCC" w:sz="4"/>
+              <w:bottom w:val="single" w:color="CCCCCC" w:sz="4"/>
+              <w:right w:val="single" w:color="CCCCCC" w:sz="4"/>
+            </w:tcBorders>
+            <w:tcMar>
+              <w:top w:type="dxa" w:w="100"/>
+              <w:left w:type="dxa" w:w="120"/>
+              <w:bottom w:type="dxa" w:w="100"/>
+              <w:right w:type="dxa" w:w="120"/>
+            </w:tcMar>
+            <w:vAlign w:val="center"/>
+          </w:tcPr>
+          <w:p>
+            <w:pPr>
+              <w:jc w:val="left"/>
+            </w:pPr>
+            <w:r>
+              <w:rPr>
+                <w:b w:val="false"/>
+                <w:bCs w:val="false"/>
+                <w:i w:val="false"/>
+                <w:iCs w:val="false"/>
+                <w:sz w:val="19"/>
+                <w:szCs w:val="19"/>
+              </w:rPr>
+              <w:t xml:space="preserve">Algoritmo de Brandes (betweenness exata) sobre o grafo de afinidade de SVA, e proxy harmônico simplificado no dígrafo de categorias; mede o papel estrutural de um nó/SVA na jornada.</w:t>
+            </w:r>
+          </w:p>
+        </w:tc>
+      </w:tr>
+      <w:tr>
+        <w:tc>
+          <w:tcPr>
+            <w:tcW w:type="dxa" w:w="2100"/>
+            <w:tcBorders>
+              <w:top w:val="single" w:color="CCCCCC" w:sz="4"/>
+              <w:left w:val="single" w:color="CCCCCC" w:sz="4"/>
+              <w:bottom w:val="single" w:color="CCCCCC" w:sz="4"/>
+              <w:right w:val="single" w:color="CCCCCC" w:sz="4"/>
+            </w:tcBorders>
+            <w:tcMar>
+              <w:top w:type="dxa" w:w="100"/>
+              <w:left w:type="dxa" w:w="120"/>
+              <w:bottom w:type="dxa" w:w="100"/>
+              <w:right w:type="dxa" w:w="120"/>
+            </w:tcMar>
+            <w:vAlign w:val="center"/>
+          </w:tcPr>
+          <w:p>
+            <w:pPr>
+              <w:jc w:val="left"/>
+            </w:pPr>
+            <w:r>
+              <w:rPr>
+                <w:b/>
+                <w:bCs/>
+                <w:i w:val="false"/>
+                <w:iCs w:val="false"/>
+                <w:sz w:val="19"/>
+                <w:szCs w:val="19"/>
+              </w:rPr>
+              <w:t xml:space="preserve">Churn Signal</w:t>
+            </w:r>
+          </w:p>
+        </w:tc>
+        <w:tc>
+          <w:tcPr>
+            <w:tcW w:type="dxa" w:w="1500"/>
+            <w:tcBorders>
+              <w:top w:val="single" w:color="CCCCCC" w:sz="4"/>
+              <w:left w:val="single" w:color="CCCCCC" w:sz="4"/>
+              <w:bottom w:val="single" w:color="CCCCCC" w:sz="4"/>
+              <w:right w:val="single" w:color="CCCCCC" w:sz="4"/>
+            </w:tcBorders>
+            <w:tcMar>
+              <w:top w:type="dxa" w:w="100"/>
+              <w:left w:type="dxa" w:w="120"/>
+              <w:bottom w:type="dxa" w:w="100"/>
+              <w:right w:type="dxa" w:w="120"/>
+            </w:tcMar>
+            <w:vAlign w:val="center"/>
+          </w:tcPr>
+          <w:p>
+            <w:pPr>
+              <w:jc w:val="left"/>
+            </w:pPr>
+            <w:r>
+              <w:rPr>
+                <w:b w:val="false"/>
+                <w:bCs w:val="false"/>
+                <w:i w:val="false"/>
+                <w:iCs w:val="false"/>
+                <w:color w:val="4A6A8A"/>
+                <w:sz w:val="19"/>
+                <w:szCs w:val="19"/>
+              </w:rPr>
+              <w:t xml:space="preserve">Indicador</w:t>
+            </w:r>
+          </w:p>
+        </w:tc>
+        <w:tc>
+          <w:tcPr>
+            <w:tcW w:type="dxa" w:w="5760"/>
+            <w:tcBorders>
+              <w:top w:val="single" w:color="CCCCCC" w:sz="4"/>
+              <w:left w:val="single" w:color="CCCCCC" w:sz="4"/>
+              <w:bottom w:val="single" w:color="CCCCCC" w:sz="4"/>
+              <w:right w:val="single" w:color="CCCCCC" w:sz="4"/>
+            </w:tcBorders>
+            <w:tcMar>
+              <w:top w:type="dxa" w:w="100"/>
+              <w:left w:type="dxa" w:w="120"/>
+              <w:bottom w:type="dxa" w:w="100"/>
+              <w:right w:type="dxa" w:w="120"/>
+            </w:tcMar>
+            <w:vAlign w:val="center"/>
+          </w:tcPr>
+          <w:p>
+            <w:pPr>
+              <w:jc w:val="left"/>
+            </w:pPr>
+            <w:r>
+              <w:rPr>
+                <w:b w:val="false"/>
+                <w:bCs w:val="false"/>
+                <w:i w:val="false"/>
+                <w:iCs w:val="false"/>
+                <w:sz w:val="19"/>
+                <w:szCs w:val="19"/>
+              </w:rPr>
+              <w:t xml:space="preserve">Score 0–100 de risco de cancelamento por assinante: queda de volume + dias sem sessão + redução de sessão + tendência.</w:t>
+            </w:r>
+          </w:p>
+        </w:tc>
+      </w:tr>
+      <w:tr>
+        <w:tc>
+          <w:tcPr>
+            <w:tcW w:type="dxa" w:w="2100"/>
+            <w:tcBorders>
+              <w:top w:val="single" w:color="CCCCCC" w:sz="4"/>
+              <w:left w:val="single" w:color="CCCCCC" w:sz="4"/>
+              <w:bottom w:val="single" w:color="CCCCCC" w:sz="4"/>
+              <w:right w:val="single" w:color="CCCCCC" w:sz="4"/>
+            </w:tcBorders>
+            <w:tcMar>
+              <w:top w:type="dxa" w:w="100"/>
+              <w:left w:type="dxa" w:w="120"/>
+              <w:bottom w:type="dxa" w:w="100"/>
+              <w:right w:type="dxa" w:w="120"/>
+            </w:tcMar>
+            <w:vAlign w:val="center"/>
+          </w:tcPr>
+          <w:p>
+            <w:pPr>
+              <w:jc w:val="left"/>
+            </w:pPr>
+            <w:r>
+              <w:rPr>
+                <w:b/>
+                <w:bCs/>
+                <w:i w:val="false"/>
+                <w:iCs w:val="false"/>
+                <w:sz w:val="19"/>
+                <w:szCs w:val="19"/>
+              </w:rPr>
+              <w:t xml:space="preserve">ClassInd</w:t>
+            </w:r>
+          </w:p>
+        </w:tc>
+        <w:tc>
+          <w:tcPr>
+            <w:tcW w:type="dxa" w:w="1500"/>
+            <w:tcBorders>
+              <w:top w:val="single" w:color="CCCCCC" w:sz="4"/>
+              <w:left w:val="single" w:color="CCCCCC" w:sz="4"/>
+              <w:bottom w:val="single" w:color="CCCCCC" w:sz="4"/>
+              <w:right w:val="single" w:color="CCCCCC" w:sz="4"/>
+            </w:tcBorders>
+            <w:tcMar>
+              <w:top w:type="dxa" w:w="100"/>
+              <w:left w:type="dxa" w:w="120"/>
+              <w:bottom w:type="dxa" w:w="100"/>
+              <w:right w:type="dxa" w:w="120"/>
+            </w:tcMar>
+            <w:vAlign w:val="center"/>
+          </w:tcPr>
+          <w:p>
+            <w:pPr>
+              <w:jc w:val="left"/>
+            </w:pPr>
+            <w:r>
+              <w:rPr>
+                <w:b w:val="false"/>
+                <w:bCs w:val="false"/>
+                <w:i w:val="false"/>
+                <w:iCs w:val="false"/>
+                <w:color w:val="4A6A8A"/>
+                <w:sz w:val="19"/>
+                <w:szCs w:val="19"/>
+              </w:rPr>
+              <w:t xml:space="preserve">Sigla</w:t>
+            </w:r>
+          </w:p>
+        </w:tc>
+        <w:tc>
+          <w:tcPr>
+            <w:tcW w:type="dxa" w:w="5760"/>
+            <w:tcBorders>
+              <w:top w:val="single" w:color="CCCCCC" w:sz="4"/>
+              <w:left w:val="single" w:color="CCCCCC" w:sz="4"/>
+              <w:bottom w:val="single" w:color="CCCCCC" w:sz="4"/>
+              <w:right w:val="single" w:color="CCCCCC" w:sz="4"/>
+            </w:tcBorders>
+            <w:tcMar>
+              <w:top w:type="dxa" w:w="100"/>
+              <w:left w:type="dxa" w:w="120"/>
+              <w:bottom w:type="dxa" w:w="100"/>
+              <w:right w:type="dxa" w:w="120"/>
+            </w:tcMar>
+            <w:vAlign w:val="center"/>
+          </w:tcPr>
+          <w:p>
+            <w:pPr>
+              <w:jc w:val="left"/>
+            </w:pPr>
+            <w:r>
+              <w:rPr>
+                <w:b w:val="false"/>
+                <w:bCs w:val="false"/>
+                <w:i w:val="false"/>
+                <w:iCs w:val="false"/>
+                <w:sz w:val="19"/>
+                <w:szCs w:val="19"/>
+              </w:rPr>
+              <w:t xml:space="preserve">Classificação Indicativa — sistema brasileiro de classificação etária de conteúdo; % de bytes em SVAs 16/18 anos no grupo com Score de Menoridade ≥60.</w:t>
+            </w:r>
+          </w:p>
+        </w:tc>
+      </w:tr>
+      <w:tr>
+        <w:tc>
+          <w:tcPr>
+            <w:tcW w:type="dxa" w:w="2100"/>
+            <w:tcBorders>
+              <w:top w:val="single" w:color="CCCCCC" w:sz="4"/>
+              <w:left w:val="single" w:color="CCCCCC" w:sz="4"/>
+              <w:bottom w:val="single" w:color="CCCCCC" w:sz="4"/>
+              <w:right w:val="single" w:color="CCCCCC" w:sz="4"/>
+            </w:tcBorders>
+            <w:tcMar>
+              <w:top w:type="dxa" w:w="100"/>
+              <w:left w:type="dxa" w:w="120"/>
+              <w:bottom w:type="dxa" w:w="100"/>
+              <w:right w:type="dxa" w:w="120"/>
+            </w:tcMar>
+            <w:vAlign w:val="center"/>
+          </w:tcPr>
+          <w:p>
+            <w:pPr>
+              <w:jc w:val="left"/>
+            </w:pPr>
+            <w:r>
+              <w:rPr>
+                <w:b/>
+                <w:bCs/>
+                <w:i w:val="false"/>
+                <w:iCs w:val="false"/>
+                <w:sz w:val="19"/>
+                <w:szCs w:val="19"/>
+              </w:rPr>
+              <w:t xml:space="preserve">Congestionamento OLT</w:t>
+            </w:r>
+          </w:p>
+        </w:tc>
+        <w:tc>
+          <w:tcPr>
+            <w:tcW w:type="dxa" w:w="1500"/>
+            <w:tcBorders>
+              <w:top w:val="single" w:color="CCCCCC" w:sz="4"/>
+              <w:left w:val="single" w:color="CCCCCC" w:sz="4"/>
+              <w:bottom w:val="single" w:color="CCCCCC" w:sz="4"/>
+              <w:right w:val="single" w:color="CCCCCC" w:sz="4"/>
+            </w:tcBorders>
+            <w:tcMar>
+              <w:top w:type="dxa" w:w="100"/>
+              <w:left w:type="dxa" w:w="120"/>
+              <w:bottom w:type="dxa" w:w="100"/>
+              <w:right w:type="dxa" w:w="120"/>
+            </w:tcMar>
+            <w:vAlign w:val="center"/>
+          </w:tcPr>
+          <w:p>
+            <w:pPr>
+              <w:jc w:val="left"/>
+            </w:pPr>
+            <w:r>
+              <w:rPr>
+                <w:b w:val="false"/>
+                <w:bCs w:val="false"/>
+                <w:i w:val="false"/>
+                <w:iCs w:val="false"/>
+                <w:color w:val="4A6A8A"/>
+                <w:sz w:val="19"/>
+                <w:szCs w:val="19"/>
+              </w:rPr>
+              <w:t xml:space="preserve">Indicador</w:t>
+            </w:r>
+          </w:p>
+        </w:tc>
+        <w:tc>
+          <w:tcPr>
+            <w:tcW w:type="dxa" w:w="5760"/>
+            <w:tcBorders>
+              <w:top w:val="single" w:color="CCCCCC" w:sz="4"/>
+              <w:left w:val="single" w:color="CCCCCC" w:sz="4"/>
+              <w:bottom w:val="single" w:color="CCCCCC" w:sz="4"/>
+              <w:right w:val="single" w:color="CCCCCC" w:sz="4"/>
+            </w:tcBorders>
+            <w:tcMar>
+              <w:top w:type="dxa" w:w="100"/>
+              <w:left w:type="dxa" w:w="120"/>
+              <w:bottom w:type="dxa" w:w="100"/>
+              <w:right w:type="dxa" w:w="120"/>
+            </w:tcMar>
+            <w:vAlign w:val="center"/>
+          </w:tcPr>
+          <w:p>
+            <w:pPr>
+              <w:jc w:val="left"/>
+            </w:pPr>
+            <w:r>
+              <w:rPr>
+                <w:b w:val="false"/>
+                <w:bCs w:val="false"/>
+                <w:i w:val="false"/>
+                <w:iCs w:val="false"/>
+                <w:sz w:val="19"/>
+                <w:szCs w:val="19"/>
+              </w:rPr>
+              <w:t xml:space="preserve">Saturação por equipamento OLT calculada a partir do Busy Hour — base de priorização de manutenção e dimensionamento de capacidade.</w:t>
+            </w:r>
+          </w:p>
+        </w:tc>
+      </w:tr>
+      <w:tr>
+        <w:tc>
+          <w:tcPr>
+            <w:tcW w:type="dxa" w:w="2100"/>
+            <w:tcBorders>
+              <w:top w:val="single" w:color="CCCCCC" w:sz="4"/>
+              <w:left w:val="single" w:color="CCCCCC" w:sz="4"/>
+              <w:bottom w:val="single" w:color="CCCCCC" w:sz="4"/>
+              <w:right w:val="single" w:color="CCCCCC" w:sz="4"/>
+            </w:tcBorders>
+            <w:tcMar>
+              <w:top w:type="dxa" w:w="100"/>
+              <w:left w:type="dxa" w:w="120"/>
+              <w:bottom w:type="dxa" w:w="100"/>
+              <w:right w:type="dxa" w:w="120"/>
+            </w:tcMar>
+            <w:vAlign w:val="center"/>
+          </w:tcPr>
+          <w:p>
+            <w:pPr>
+              <w:jc w:val="left"/>
+            </w:pPr>
+            <w:r>
+              <w:rPr>
+                <w:b/>
+                <w:bCs/>
+                <w:i w:val="false"/>
+                <w:iCs w:val="false"/>
+                <w:sz w:val="19"/>
+                <w:szCs w:val="19"/>
+              </w:rPr>
+              <w:t xml:space="preserve">Dependência de IA Generativa</w:t>
+            </w:r>
+          </w:p>
+        </w:tc>
+        <w:tc>
+          <w:tcPr>
+            <w:tcW w:type="dxa" w:w="1500"/>
+            <w:tcBorders>
+              <w:top w:val="single" w:color="CCCCCC" w:sz="4"/>
+              <w:left w:val="single" w:color="CCCCCC" w:sz="4"/>
+              <w:bottom w:val="single" w:color="CCCCCC" w:sz="4"/>
+              <w:right w:val="single" w:color="CCCCCC" w:sz="4"/>
+            </w:tcBorders>
+            <w:tcMar>
+              <w:top w:type="dxa" w:w="100"/>
+              <w:left w:type="dxa" w:w="120"/>
+              <w:bottom w:type="dxa" w:w="100"/>
+              <w:right w:type="dxa" w:w="120"/>
+            </w:tcMar>
+            <w:vAlign w:val="center"/>
+          </w:tcPr>
+          <w:p>
+            <w:pPr>
+              <w:jc w:val="left"/>
+            </w:pPr>
+            <w:r>
+              <w:rPr>
+                <w:b w:val="false"/>
+                <w:bCs w:val="false"/>
+                <w:i w:val="false"/>
+                <w:iCs w:val="false"/>
+                <w:color w:val="4A6A8A"/>
+                <w:sz w:val="19"/>
+                <w:szCs w:val="19"/>
+              </w:rPr>
+              <w:t xml:space="preserve">Indicador</w:t>
+            </w:r>
+          </w:p>
+        </w:tc>
+        <w:tc>
+          <w:tcPr>
+            <w:tcW w:type="dxa" w:w="5760"/>
+            <w:tcBorders>
+              <w:top w:val="single" w:color="CCCCCC" w:sz="4"/>
+              <w:left w:val="single" w:color="CCCCCC" w:sz="4"/>
+              <w:bottom w:val="single" w:color="CCCCCC" w:sz="4"/>
+              <w:right w:val="single" w:color="CCCCCC" w:sz="4"/>
+            </w:tcBorders>
+            <w:tcMar>
+              <w:top w:type="dxa" w:w="100"/>
+              <w:left w:type="dxa" w:w="120"/>
+              <w:bottom w:type="dxa" w:w="100"/>
+              <w:right w:type="dxa" w:w="120"/>
+            </w:tcMar>
+            <w:vAlign w:val="center"/>
+          </w:tcPr>
+          <w:p>
+            <w:pPr>
+              <w:jc w:val="left"/>
+            </w:pPr>
+            <w:r>
+              <w:rPr>
+                <w:b w:val="false"/>
+                <w:bCs w:val="false"/>
+                <w:i w:val="false"/>
+                <w:iCs w:val="false"/>
+                <w:sz w:val="19"/>
+                <w:szCs w:val="19"/>
+              </w:rPr>
+              <w:t xml:space="preserve">Intensidade de uso de assistentes de IA por SNI: 50% % bytes IA + 30% frequência de sessões + 20% padrão noturno.</w:t>
+            </w:r>
+          </w:p>
+        </w:tc>
+      </w:tr>
+      <w:tr>
+        <w:tc>
+          <w:tcPr>
+            <w:tcW w:type="dxa" w:w="2100"/>
+            <w:tcBorders>
+              <w:top w:val="single" w:color="CCCCCC" w:sz="4"/>
+              <w:left w:val="single" w:color="CCCCCC" w:sz="4"/>
+              <w:bottom w:val="single" w:color="CCCCCC" w:sz="4"/>
+              <w:right w:val="single" w:color="CCCCCC" w:sz="4"/>
+            </w:tcBorders>
+            <w:tcMar>
+              <w:top w:type="dxa" w:w="100"/>
+              <w:left w:type="dxa" w:w="120"/>
+              <w:bottom w:type="dxa" w:w="100"/>
+              <w:right w:type="dxa" w:w="120"/>
+            </w:tcMar>
+            <w:vAlign w:val="center"/>
+          </w:tcPr>
+          <w:p>
+            <w:pPr>
+              <w:jc w:val="left"/>
+            </w:pPr>
+            <w:r>
+              <w:rPr>
+                <w:b/>
+                <w:bCs/>
+                <w:i w:val="false"/>
+                <w:iCs w:val="false"/>
+                <w:sz w:val="19"/>
+                <w:szCs w:val="19"/>
+              </w:rPr>
+              <w:t xml:space="preserve">eTOM</w:t>
+            </w:r>
+          </w:p>
+        </w:tc>
+        <w:tc>
+          <w:tcPr>
+            <w:tcW w:type="dxa" w:w="1500"/>
+            <w:tcBorders>
+              <w:top w:val="single" w:color="CCCCCC" w:sz="4"/>
+              <w:left w:val="single" w:color="CCCCCC" w:sz="4"/>
+              <w:bottom w:val="single" w:color="CCCCCC" w:sz="4"/>
+              <w:right w:val="single" w:color="CCCCCC" w:sz="4"/>
+            </w:tcBorders>
+            <w:tcMar>
+              <w:top w:type="dxa" w:w="100"/>
+              <w:left w:type="dxa" w:w="120"/>
+              <w:bottom w:type="dxa" w:w="100"/>
+              <w:right w:type="dxa" w:w="120"/>
+            </w:tcMar>
+            <w:vAlign w:val="center"/>
+          </w:tcPr>
+          <w:p>
+            <w:pPr>
+              <w:jc w:val="left"/>
+            </w:pPr>
+            <w:r>
+              <w:rPr>
+                <w:b w:val="false"/>
+                <w:bCs w:val="false"/>
+                <w:i w:val="false"/>
+                <w:iCs w:val="false"/>
+                <w:color w:val="4A6A8A"/>
+                <w:sz w:val="19"/>
+                <w:szCs w:val="19"/>
+              </w:rPr>
+              <w:t xml:space="preserve">Norma/Framework</w:t>
+            </w:r>
+          </w:p>
+        </w:tc>
+        <w:tc>
+          <w:tcPr>
+            <w:tcW w:type="dxa" w:w="5760"/>
+            <w:tcBorders>
+              <w:top w:val="single" w:color="CCCCCC" w:sz="4"/>
+              <w:left w:val="single" w:color="CCCCCC" w:sz="4"/>
+              <w:bottom w:val="single" w:color="CCCCCC" w:sz="4"/>
+              <w:right w:val="single" w:color="CCCCCC" w:sz="4"/>
+            </w:tcBorders>
+            <w:tcMar>
+              <w:top w:type="dxa" w:w="100"/>
+              <w:left w:type="dxa" w:w="120"/>
+              <w:bottom w:type="dxa" w:w="100"/>
+              <w:right w:type="dxa" w:w="120"/>
+            </w:tcMar>
+            <w:vAlign w:val="center"/>
+          </w:tcPr>
+          <w:p>
+            <w:pPr>
+              <w:jc w:val="left"/>
+            </w:pPr>
+            <w:r>
+              <w:rPr>
+                <w:b w:val="false"/>
+                <w:bCs w:val="false"/>
+                <w:i w:val="false"/>
+                <w:iCs w:val="false"/>
+                <w:sz w:val="19"/>
+                <w:szCs w:val="19"/>
+              </w:rPr>
+              <w:t xml:space="preserve">Enhanced Telecom Operations Map — framework de processos de operação de telecom, originalmente da TM Forum (GB921), incorporado pela ITU-T na série M.3050; o JourneyGraph cobre as 4 verticais da área de Assurance.</w:t>
+            </w:r>
+          </w:p>
+        </w:tc>
+      </w:tr>
+      <w:tr>
+        <w:tc>
+          <w:tcPr>
+            <w:tcW w:type="dxa" w:w="2100"/>
+            <w:tcBorders>
+              <w:top w:val="single" w:color="CCCCCC" w:sz="4"/>
+              <w:left w:val="single" w:color="CCCCCC" w:sz="4"/>
+              <w:bottom w:val="single" w:color="CCCCCC" w:sz="4"/>
+              <w:right w:val="single" w:color="CCCCCC" w:sz="4"/>
+            </w:tcBorders>
+            <w:tcMar>
+              <w:top w:type="dxa" w:w="100"/>
+              <w:left w:type="dxa" w:w="120"/>
+              <w:bottom w:type="dxa" w:w="100"/>
+              <w:right w:type="dxa" w:w="120"/>
+            </w:tcMar>
+            <w:vAlign w:val="center"/>
+          </w:tcPr>
+          <w:p>
+            <w:pPr>
+              <w:jc w:val="left"/>
+            </w:pPr>
+            <w:r>
+              <w:rPr>
+                <w:b/>
+                <w:bCs/>
+                <w:i w:val="false"/>
+                <w:iCs w:val="false"/>
+                <w:sz w:val="19"/>
+                <w:szCs w:val="19"/>
+              </w:rPr>
+              <w:t xml:space="preserve">FCAPS</w:t>
+            </w:r>
+          </w:p>
+        </w:tc>
+        <w:tc>
+          <w:tcPr>
+            <w:tcW w:type="dxa" w:w="1500"/>
+            <w:tcBorders>
+              <w:top w:val="single" w:color="CCCCCC" w:sz="4"/>
+              <w:left w:val="single" w:color="CCCCCC" w:sz="4"/>
+              <w:bottom w:val="single" w:color="CCCCCC" w:sz="4"/>
+              <w:right w:val="single" w:color="CCCCCC" w:sz="4"/>
+            </w:tcBorders>
+            <w:tcMar>
+              <w:top w:type="dxa" w:w="100"/>
+              <w:left w:type="dxa" w:w="120"/>
+              <w:bottom w:type="dxa" w:w="100"/>
+              <w:right w:type="dxa" w:w="120"/>
+            </w:tcMar>
+            <w:vAlign w:val="center"/>
+          </w:tcPr>
+          <w:p>
+            <w:pPr>
+              <w:jc w:val="left"/>
+            </w:pPr>
+            <w:r>
+              <w:rPr>
+                <w:b w:val="false"/>
+                <w:bCs w:val="false"/>
+                <w:i w:val="false"/>
+                <w:iCs w:val="false"/>
+                <w:color w:val="4A6A8A"/>
+                <w:sz w:val="19"/>
+                <w:szCs w:val="19"/>
+              </w:rPr>
+              <w:t xml:space="preserve">Sigla</w:t>
+            </w:r>
+          </w:p>
+        </w:tc>
+        <w:tc>
+          <w:tcPr>
+            <w:tcW w:type="dxa" w:w="5760"/>
+            <w:tcBorders>
+              <w:top w:val="single" w:color="CCCCCC" w:sz="4"/>
+              <w:left w:val="single" w:color="CCCCCC" w:sz="4"/>
+              <w:bottom w:val="single" w:color="CCCCCC" w:sz="4"/>
+              <w:right w:val="single" w:color="CCCCCC" w:sz="4"/>
+            </w:tcBorders>
+            <w:tcMar>
+              <w:top w:type="dxa" w:w="100"/>
+              <w:left w:type="dxa" w:w="120"/>
+              <w:bottom w:type="dxa" w:w="100"/>
+              <w:right w:type="dxa" w:w="120"/>
+            </w:tcMar>
+            <w:vAlign w:val="center"/>
+          </w:tcPr>
+          <w:p>
+            <w:pPr>
+              <w:jc w:val="left"/>
+            </w:pPr>
+            <w:r>
+              <w:rPr>
+                <w:b w:val="false"/>
+                <w:bCs w:val="false"/>
+                <w:i w:val="false"/>
+                <w:iCs w:val="false"/>
+                <w:sz w:val="19"/>
+                <w:szCs w:val="19"/>
+              </w:rPr>
+              <w:t xml:space="preserve">Fault, Configuration, Accounting, Performance, Security — modelo ISO/ITU-T de gestão de rede; 5 KPIs da aba Qualidade do JourneyGraph.</w:t>
+            </w:r>
+          </w:p>
+        </w:tc>
+      </w:tr>
+      <w:tr>
+        <w:tc>
+          <w:tcPr>
+            <w:tcW w:type="dxa" w:w="2100"/>
+            <w:tcBorders>
+              <w:top w:val="single" w:color="CCCCCC" w:sz="4"/>
+              <w:left w:val="single" w:color="CCCCCC" w:sz="4"/>
+              <w:bottom w:val="single" w:color="CCCCCC" w:sz="4"/>
+              <w:right w:val="single" w:color="CCCCCC" w:sz="4"/>
+            </w:tcBorders>
+            <w:tcMar>
+              <w:top w:type="dxa" w:w="100"/>
+              <w:left w:type="dxa" w:w="120"/>
+              <w:bottom w:type="dxa" w:w="100"/>
+              <w:right w:type="dxa" w:w="120"/>
+            </w:tcMar>
+            <w:vAlign w:val="center"/>
+          </w:tcPr>
+          <w:p>
+            <w:pPr>
+              <w:jc w:val="left"/>
+            </w:pPr>
+            <w:r>
+              <w:rPr>
+                <w:b/>
+                <w:bCs/>
+                <w:i w:val="false"/>
+                <w:iCs w:val="false"/>
+                <w:sz w:val="19"/>
+                <w:szCs w:val="19"/>
+              </w:rPr>
+              <w:t xml:space="preserve">HHI</w:t>
+            </w:r>
+          </w:p>
+        </w:tc>
+        <w:tc>
+          <w:tcPr>
+            <w:tcW w:type="dxa" w:w="1500"/>
+            <w:tcBorders>
+              <w:top w:val="single" w:color="CCCCCC" w:sz="4"/>
+              <w:left w:val="single" w:color="CCCCCC" w:sz="4"/>
+              <w:bottom w:val="single" w:color="CCCCCC" w:sz="4"/>
+              <w:right w:val="single" w:color="CCCCCC" w:sz="4"/>
+            </w:tcBorders>
+            <w:tcMar>
+              <w:top w:type="dxa" w:w="100"/>
+              <w:left w:type="dxa" w:w="120"/>
+              <w:bottom w:type="dxa" w:w="100"/>
+              <w:right w:type="dxa" w:w="120"/>
+            </w:tcMar>
+            <w:vAlign w:val="center"/>
+          </w:tcPr>
+          <w:p>
+            <w:pPr>
+              <w:jc w:val="left"/>
+            </w:pPr>
+            <w:r>
+              <w:rPr>
+                <w:b w:val="false"/>
+                <w:bCs w:val="false"/>
+                <w:i w:val="false"/>
+                <w:iCs w:val="false"/>
+                <w:color w:val="4A6A8A"/>
+                <w:sz w:val="19"/>
+                <w:szCs w:val="19"/>
+              </w:rPr>
+              <w:t xml:space="preserve">Modelo/Técnica</w:t>
+            </w:r>
+          </w:p>
+        </w:tc>
+        <w:tc>
+          <w:tcPr>
+            <w:tcW w:type="dxa" w:w="5760"/>
+            <w:tcBorders>
+              <w:top w:val="single" w:color="CCCCCC" w:sz="4"/>
+              <w:left w:val="single" w:color="CCCCCC" w:sz="4"/>
+              <w:bottom w:val="single" w:color="CCCCCC" w:sz="4"/>
+              <w:right w:val="single" w:color="CCCCCC" w:sz="4"/>
+            </w:tcBorders>
+            <w:tcMar>
+              <w:top w:type="dxa" w:w="100"/>
+              <w:left w:type="dxa" w:w="120"/>
+              <w:bottom w:type="dxa" w:w="100"/>
+              <w:right w:type="dxa" w:w="120"/>
+            </w:tcMar>
+            <w:vAlign w:val="center"/>
+          </w:tcPr>
+          <w:p>
+            <w:pPr>
+              <w:jc w:val="left"/>
+            </w:pPr>
+            <w:r>
+              <w:rPr>
+                <w:b w:val="false"/>
+                <w:bCs w:val="false"/>
+                <w:i w:val="false"/>
+                <w:iCs w:val="false"/>
+                <w:sz w:val="19"/>
+                <w:szCs w:val="19"/>
+              </w:rPr>
+              <w:t xml:space="preserve">Índice Herfindahl-Hirschman — soma dos quadrados dos market-shares; mede concentração de bytes por SVA (FCAPS Accounting).</w:t>
+            </w:r>
+          </w:p>
+        </w:tc>
+      </w:tr>
+      <w:tr>
+        <w:tc>
+          <w:tcPr>
+            <w:tcW w:type="dxa" w:w="2100"/>
+            <w:tcBorders>
+              <w:top w:val="single" w:color="CCCCCC" w:sz="4"/>
+              <w:left w:val="single" w:color="CCCCCC" w:sz="4"/>
+              <w:bottom w:val="single" w:color="CCCCCC" w:sz="4"/>
+              <w:right w:val="single" w:color="CCCCCC" w:sz="4"/>
+            </w:tcBorders>
+            <w:tcMar>
+              <w:top w:type="dxa" w:w="100"/>
+              <w:left w:type="dxa" w:w="120"/>
+              <w:bottom w:type="dxa" w:w="100"/>
+              <w:right w:type="dxa" w:w="120"/>
+            </w:tcMar>
+            <w:vAlign w:val="center"/>
+          </w:tcPr>
+          <w:p>
+            <w:pPr>
+              <w:jc w:val="left"/>
+            </w:pPr>
+            <w:r>
+              <w:rPr>
+                <w:b/>
+                <w:bCs/>
+                <w:i w:val="false"/>
+                <w:iCs w:val="false"/>
+                <w:sz w:val="19"/>
+                <w:szCs w:val="19"/>
+              </w:rPr>
+              <w:t xml:space="preserve">IACF</w:t>
+            </w:r>
+          </w:p>
+        </w:tc>
+        <w:tc>
+          <w:tcPr>
+            <w:tcW w:type="dxa" w:w="1500"/>
+            <w:tcBorders>
+              <w:top w:val="single" w:color="CCCCCC" w:sz="4"/>
+              <w:left w:val="single" w:color="CCCCCC" w:sz="4"/>
+              <w:bottom w:val="single" w:color="CCCCCC" w:sz="4"/>
+              <w:right w:val="single" w:color="CCCCCC" w:sz="4"/>
+            </w:tcBorders>
+            <w:tcMar>
+              <w:top w:type="dxa" w:w="100"/>
+              <w:left w:type="dxa" w:w="120"/>
+              <w:bottom w:type="dxa" w:w="100"/>
+              <w:right w:type="dxa" w:w="120"/>
+            </w:tcMar>
+            <w:vAlign w:val="center"/>
+          </w:tcPr>
+          <w:p>
+            <w:pPr>
+              <w:jc w:val="left"/>
+            </w:pPr>
+            <w:r>
+              <w:rPr>
+                <w:b w:val="false"/>
+                <w:bCs w:val="false"/>
+                <w:i w:val="false"/>
+                <w:iCs w:val="false"/>
+                <w:color w:val="4A6A8A"/>
+                <w:sz w:val="19"/>
+                <w:szCs w:val="19"/>
+              </w:rPr>
+              <w:t xml:space="preserve">Indicador</w:t>
+            </w:r>
+          </w:p>
+        </w:tc>
+        <w:tc>
+          <w:tcPr>
+            <w:tcW w:type="dxa" w:w="5760"/>
+            <w:tcBorders>
+              <w:top w:val="single" w:color="CCCCCC" w:sz="4"/>
+              <w:left w:val="single" w:color="CCCCCC" w:sz="4"/>
+              <w:bottom w:val="single" w:color="CCCCCC" w:sz="4"/>
+              <w:right w:val="single" w:color="CCCCCC" w:sz="4"/>
+            </w:tcBorders>
+            <w:tcMar>
+              <w:top w:type="dxa" w:w="100"/>
+              <w:left w:type="dxa" w:w="120"/>
+              <w:bottom w:type="dxa" w:w="100"/>
+              <w:right w:type="dxa" w:w="120"/>
+            </w:tcMar>
+            <w:vAlign w:val="center"/>
+          </w:tcPr>
+          <w:p>
+            <w:pPr>
+              <w:jc w:val="left"/>
+            </w:pPr>
+            <w:r>
+              <w:rPr>
+                <w:b w:val="false"/>
+                <w:bCs w:val="false"/>
+                <w:i w:val="false"/>
+                <w:iCs w:val="false"/>
+                <w:sz w:val="19"/>
+                <w:szCs w:val="19"/>
+              </w:rPr>
+              <w:t xml:space="preserve">Índice de Assimetria de Convivência Familiar — proxy de múltiplos usuários/telas simultâneas (19h–23h): 50% sobreposição temporal + 50% diversidade de categoria concorrente.</w:t>
+            </w:r>
+          </w:p>
+        </w:tc>
+      </w:tr>
+      <w:tr>
+        <w:tc>
+          <w:tcPr>
+            <w:tcW w:type="dxa" w:w="2100"/>
+            <w:tcBorders>
+              <w:top w:val="single" w:color="CCCCCC" w:sz="4"/>
+              <w:left w:val="single" w:color="CCCCCC" w:sz="4"/>
+              <w:bottom w:val="single" w:color="CCCCCC" w:sz="4"/>
+              <w:right w:val="single" w:color="CCCCCC" w:sz="4"/>
+            </w:tcBorders>
+            <w:tcMar>
+              <w:top w:type="dxa" w:w="100"/>
+              <w:left w:type="dxa" w:w="120"/>
+              <w:bottom w:type="dxa" w:w="100"/>
+              <w:right w:type="dxa" w:w="120"/>
+            </w:tcMar>
+            <w:vAlign w:val="center"/>
+          </w:tcPr>
+          <w:p>
+            <w:pPr>
+              <w:jc w:val="left"/>
+            </w:pPr>
+            <w:r>
+              <w:rPr>
+                <w:b/>
+                <w:bCs/>
+                <w:i w:val="false"/>
+                <w:iCs w:val="false"/>
+                <w:sz w:val="19"/>
+                <w:szCs w:val="19"/>
+              </w:rPr>
+              <w:t xml:space="preserve">IFA</w:t>
+            </w:r>
+          </w:p>
+        </w:tc>
+        <w:tc>
+          <w:tcPr>
+            <w:tcW w:type="dxa" w:w="1500"/>
+            <w:tcBorders>
+              <w:top w:val="single" w:color="CCCCCC" w:sz="4"/>
+              <w:left w:val="single" w:color="CCCCCC" w:sz="4"/>
+              <w:bottom w:val="single" w:color="CCCCCC" w:sz="4"/>
+              <w:right w:val="single" w:color="CCCCCC" w:sz="4"/>
+            </w:tcBorders>
+            <w:tcMar>
+              <w:top w:type="dxa" w:w="100"/>
+              <w:left w:type="dxa" w:w="120"/>
+              <w:bottom w:type="dxa" w:w="100"/>
+              <w:right w:type="dxa" w:w="120"/>
+            </w:tcMar>
+            <w:vAlign w:val="center"/>
+          </w:tcPr>
+          <w:p>
+            <w:pPr>
+              <w:jc w:val="left"/>
+            </w:pPr>
+            <w:r>
+              <w:rPr>
+                <w:b w:val="false"/>
+                <w:bCs w:val="false"/>
+                <w:i w:val="false"/>
+                <w:iCs w:val="false"/>
+                <w:color w:val="4A6A8A"/>
+                <w:sz w:val="19"/>
+                <w:szCs w:val="19"/>
+              </w:rPr>
+              <w:t xml:space="preserve">Indicador</w:t>
+            </w:r>
+          </w:p>
+        </w:tc>
+        <w:tc>
+          <w:tcPr>
+            <w:tcW w:type="dxa" w:w="5760"/>
+            <w:tcBorders>
+              <w:top w:val="single" w:color="CCCCCC" w:sz="4"/>
+              <w:left w:val="single" w:color="CCCCCC" w:sz="4"/>
+              <w:bottom w:val="single" w:color="CCCCCC" w:sz="4"/>
+              <w:right w:val="single" w:color="CCCCCC" w:sz="4"/>
+            </w:tcBorders>
+            <w:tcMar>
+              <w:top w:type="dxa" w:w="100"/>
+              <w:left w:type="dxa" w:w="120"/>
+              <w:bottom w:type="dxa" w:w="100"/>
+              <w:right w:type="dxa" w:w="120"/>
+            </w:tcMar>
+            <w:vAlign w:val="center"/>
+          </w:tcPr>
+          <w:p>
+            <w:pPr>
+              <w:jc w:val="left"/>
+            </w:pPr>
+            <w:r>
+              <w:rPr>
+                <w:b w:val="false"/>
+                <w:bCs w:val="false"/>
+                <w:i w:val="false"/>
+                <w:iCs w:val="false"/>
+                <w:sz w:val="19"/>
+                <w:szCs w:val="19"/>
+              </w:rPr>
+              <w:t xml:space="preserve">Índice de Fragmentação de Atenção — alternância de categoria dentro de sessão ativa: 60% transições/hora + 40% CV da duração dos fluxos.</w:t>
+            </w:r>
+          </w:p>
+        </w:tc>
+      </w:tr>
+      <w:tr>
+        <w:tc>
+          <w:tcPr>
+            <w:tcW w:type="dxa" w:w="2100"/>
+            <w:tcBorders>
+              <w:top w:val="single" w:color="CCCCCC" w:sz="4"/>
+              <w:left w:val="single" w:color="CCCCCC" w:sz="4"/>
+              <w:bottom w:val="single" w:color="CCCCCC" w:sz="4"/>
+              <w:right w:val="single" w:color="CCCCCC" w:sz="4"/>
+            </w:tcBorders>
+            <w:tcMar>
+              <w:top w:type="dxa" w:w="100"/>
+              <w:left w:type="dxa" w:w="120"/>
+              <w:bottom w:type="dxa" w:w="100"/>
+              <w:right w:type="dxa" w:w="120"/>
+            </w:tcMar>
+            <w:vAlign w:val="center"/>
+          </w:tcPr>
+          <w:p>
+            <w:pPr>
+              <w:jc w:val="left"/>
+            </w:pPr>
+            <w:r>
+              <w:rPr>
+                <w:b/>
+                <w:bCs/>
+                <w:i w:val="false"/>
+                <w:iCs w:val="false"/>
+                <w:sz w:val="19"/>
+                <w:szCs w:val="19"/>
+              </w:rPr>
+              <w:t xml:space="preserve">IFCN</w:t>
+            </w:r>
+          </w:p>
+        </w:tc>
+        <w:tc>
+          <w:tcPr>
+            <w:tcW w:type="dxa" w:w="1500"/>
+            <w:tcBorders>
+              <w:top w:val="single" w:color="CCCCCC" w:sz="4"/>
+              <w:left w:val="single" w:color="CCCCCC" w:sz="4"/>
+              <w:bottom w:val="single" w:color="CCCCCC" w:sz="4"/>
+              <w:right w:val="single" w:color="CCCCCC" w:sz="4"/>
+            </w:tcBorders>
+            <w:tcMar>
+              <w:top w:type="dxa" w:w="100"/>
+              <w:left w:type="dxa" w:w="120"/>
+              <w:bottom w:type="dxa" w:w="100"/>
+              <w:right w:type="dxa" w:w="120"/>
+            </w:tcMar>
+            <w:vAlign w:val="center"/>
+          </w:tcPr>
+          <w:p>
+            <w:pPr>
+              <w:jc w:val="left"/>
+            </w:pPr>
+            <w:r>
+              <w:rPr>
+                <w:b w:val="false"/>
+                <w:bCs w:val="false"/>
+                <w:i w:val="false"/>
+                <w:iCs w:val="false"/>
+                <w:color w:val="4A6A8A"/>
+                <w:sz w:val="19"/>
+                <w:szCs w:val="19"/>
+              </w:rPr>
+              <w:t xml:space="preserve">Indicador</w:t>
+            </w:r>
+          </w:p>
+        </w:tc>
+        <w:tc>
+          <w:tcPr>
+            <w:tcW w:type="dxa" w:w="5760"/>
+            <w:tcBorders>
+              <w:top w:val="single" w:color="CCCCCC" w:sz="4"/>
+              <w:left w:val="single" w:color="CCCCCC" w:sz="4"/>
+              <w:bottom w:val="single" w:color="CCCCCC" w:sz="4"/>
+              <w:right w:val="single" w:color="CCCCCC" w:sz="4"/>
+            </w:tcBorders>
+            <w:tcMar>
+              <w:top w:type="dxa" w:w="100"/>
+              <w:left w:type="dxa" w:w="120"/>
+              <w:bottom w:type="dxa" w:w="100"/>
+              <w:right w:type="dxa" w:w="120"/>
+            </w:tcMar>
+            <w:vAlign w:val="center"/>
+          </w:tcPr>
+          <w:p>
+            <w:pPr>
+              <w:jc w:val="left"/>
+            </w:pPr>
+            <w:r>
+              <w:rPr>
+                <w:b w:val="false"/>
+                <w:bCs w:val="false"/>
+                <w:i w:val="false"/>
+                <w:iCs w:val="false"/>
+                <w:sz w:val="19"/>
+                <w:szCs w:val="19"/>
+              </w:rPr>
+              <w:t xml:space="preserve">Índice de Fadiga Cognitiva Noturna — transição de tráfego cognitivo para passivo (20h–22h): 50% % passivo 20h–22h + 50% queda de cloud_work.</w:t>
+            </w:r>
+          </w:p>
+        </w:tc>
+      </w:tr>
+      <w:tr>
+        <w:tc>
+          <w:tcPr>
+            <w:tcW w:type="dxa" w:w="2100"/>
+            <w:tcBorders>
+              <w:top w:val="single" w:color="CCCCCC" w:sz="4"/>
+              <w:left w:val="single" w:color="CCCCCC" w:sz="4"/>
+              <w:bottom w:val="single" w:color="CCCCCC" w:sz="4"/>
+              <w:right w:val="single" w:color="CCCCCC" w:sz="4"/>
+            </w:tcBorders>
+            <w:tcMar>
+              <w:top w:type="dxa" w:w="100"/>
+              <w:left w:type="dxa" w:w="120"/>
+              <w:bottom w:type="dxa" w:w="100"/>
+              <w:right w:type="dxa" w:w="120"/>
+            </w:tcMar>
+            <w:vAlign w:val="center"/>
+          </w:tcPr>
+          <w:p>
+            <w:pPr>
+              <w:jc w:val="left"/>
+            </w:pPr>
+            <w:r>
+              <w:rPr>
+                <w:b/>
+                <w:bCs/>
+                <w:i w:val="false"/>
+                <w:iCs w:val="false"/>
+                <w:sz w:val="19"/>
+                <w:szCs w:val="19"/>
+              </w:rPr>
+              <w:t xml:space="preserve">IPFIX / NetFlow</w:t>
+            </w:r>
+          </w:p>
+        </w:tc>
+        <w:tc>
+          <w:tcPr>
+            <w:tcW w:type="dxa" w:w="1500"/>
+            <w:tcBorders>
+              <w:top w:val="single" w:color="CCCCCC" w:sz="4"/>
+              <w:left w:val="single" w:color="CCCCCC" w:sz="4"/>
+              <w:bottom w:val="single" w:color="CCCCCC" w:sz="4"/>
+              <w:right w:val="single" w:color="CCCCCC" w:sz="4"/>
+            </w:tcBorders>
+            <w:tcMar>
+              <w:top w:type="dxa" w:w="100"/>
+              <w:left w:type="dxa" w:w="120"/>
+              <w:bottom w:type="dxa" w:w="100"/>
+              <w:right w:type="dxa" w:w="120"/>
+            </w:tcMar>
+            <w:vAlign w:val="center"/>
+          </w:tcPr>
+          <w:p>
+            <w:pPr>
+              <w:jc w:val="left"/>
+            </w:pPr>
+            <w:r>
+              <w:rPr>
+                <w:b w:val="false"/>
+                <w:bCs w:val="false"/>
+                <w:i w:val="false"/>
+                <w:iCs w:val="false"/>
+                <w:color w:val="4A6A8A"/>
+                <w:sz w:val="19"/>
+                <w:szCs w:val="19"/>
+              </w:rPr>
+              <w:t xml:space="preserve">Sigla</w:t>
+            </w:r>
+          </w:p>
+        </w:tc>
+        <w:tc>
+          <w:tcPr>
+            <w:tcW w:type="dxa" w:w="5760"/>
+            <w:tcBorders>
+              <w:top w:val="single" w:color="CCCCCC" w:sz="4"/>
+              <w:left w:val="single" w:color="CCCCCC" w:sz="4"/>
+              <w:bottom w:val="single" w:color="CCCCCC" w:sz="4"/>
+              <w:right w:val="single" w:color="CCCCCC" w:sz="4"/>
+            </w:tcBorders>
+            <w:tcMar>
+              <w:top w:type="dxa" w:w="100"/>
+              <w:left w:type="dxa" w:w="120"/>
+              <w:bottom w:type="dxa" w:w="100"/>
+              <w:right w:type="dxa" w:w="120"/>
+            </w:tcMar>
+            <w:vAlign w:val="center"/>
+          </w:tcPr>
+          <w:p>
+            <w:pPr>
+              <w:jc w:val="left"/>
+            </w:pPr>
+            <w:r>
+              <w:rPr>
+                <w:b w:val="false"/>
+                <w:bCs w:val="false"/>
+                <w:i w:val="false"/>
+                <w:iCs w:val="false"/>
+                <w:sz w:val="19"/>
+                <w:szCs w:val="19"/>
+              </w:rPr>
+              <w:t xml:space="preserve">Protocolos de exportação de fluxo de rede (v9/v10) — uma das duas fontes de dado nativas do produto (16.175.160 fluxos na base de referência).</w:t>
+            </w:r>
+          </w:p>
+        </w:tc>
+      </w:tr>
+      <w:tr>
+        <w:tc>
+          <w:tcPr>
+            <w:tcW w:type="dxa" w:w="2100"/>
+            <w:tcBorders>
+              <w:top w:val="single" w:color="CCCCCC" w:sz="4"/>
+              <w:left w:val="single" w:color="CCCCCC" w:sz="4"/>
+              <w:bottom w:val="single" w:color="CCCCCC" w:sz="4"/>
+              <w:right w:val="single" w:color="CCCCCC" w:sz="4"/>
+            </w:tcBorders>
+            <w:tcMar>
+              <w:top w:type="dxa" w:w="100"/>
+              <w:left w:type="dxa" w:w="120"/>
+              <w:bottom w:type="dxa" w:w="100"/>
+              <w:right w:type="dxa" w:w="120"/>
+            </w:tcMar>
+            <w:vAlign w:val="center"/>
+          </w:tcPr>
+          <w:p>
+            <w:pPr>
+              <w:jc w:val="left"/>
+            </w:pPr>
+            <w:r>
+              <w:rPr>
+                <w:b/>
+                <w:bCs/>
+                <w:i w:val="false"/>
+                <w:iCs w:val="false"/>
+                <w:sz w:val="19"/>
+                <w:szCs w:val="19"/>
+              </w:rPr>
+              <w:t xml:space="preserve">IQRE_ISP</w:t>
+            </w:r>
+          </w:p>
+        </w:tc>
+        <w:tc>
+          <w:tcPr>
+            <w:tcW w:type="dxa" w:w="1500"/>
+            <w:tcBorders>
+              <w:top w:val="single" w:color="CCCCCC" w:sz="4"/>
+              <w:left w:val="single" w:color="CCCCCC" w:sz="4"/>
+              <w:bottom w:val="single" w:color="CCCCCC" w:sz="4"/>
+              <w:right w:val="single" w:color="CCCCCC" w:sz="4"/>
+            </w:tcBorders>
+            <w:tcMar>
+              <w:top w:type="dxa" w:w="100"/>
+              <w:left w:type="dxa" w:w="120"/>
+              <w:bottom w:type="dxa" w:w="100"/>
+              <w:right w:type="dxa" w:w="120"/>
+            </w:tcMar>
+            <w:vAlign w:val="center"/>
+          </w:tcPr>
+          <w:p>
+            <w:pPr>
+              <w:jc w:val="left"/>
+            </w:pPr>
+            <w:r>
+              <w:rPr>
+                <w:b w:val="false"/>
+                <w:bCs w:val="false"/>
+                <w:i w:val="false"/>
+                <w:iCs w:val="false"/>
+                <w:color w:val="4A6A8A"/>
+                <w:sz w:val="19"/>
+                <w:szCs w:val="19"/>
+              </w:rPr>
+              <w:t xml:space="preserve">Indicador</w:t>
+            </w:r>
+          </w:p>
+        </w:tc>
+        <w:tc>
+          <w:tcPr>
+            <w:tcW w:type="dxa" w:w="5760"/>
+            <w:tcBorders>
+              <w:top w:val="single" w:color="CCCCCC" w:sz="4"/>
+              <w:left w:val="single" w:color="CCCCCC" w:sz="4"/>
+              <w:bottom w:val="single" w:color="CCCCCC" w:sz="4"/>
+              <w:right w:val="single" w:color="CCCCCC" w:sz="4"/>
+            </w:tcBorders>
+            <w:tcMar>
+              <w:top w:type="dxa" w:w="100"/>
+              <w:left w:type="dxa" w:w="120"/>
+              <w:bottom w:type="dxa" w:w="100"/>
+              <w:right w:type="dxa" w:w="120"/>
+            </w:tcMar>
+            <w:vAlign w:val="center"/>
+          </w:tcPr>
+          <w:p>
+            <w:pPr>
+              <w:jc w:val="left"/>
+            </w:pPr>
+            <w:r>
+              <w:rPr>
+                <w:b w:val="false"/>
+                <w:bCs w:val="false"/>
+                <w:i w:val="false"/>
+                <w:iCs w:val="false"/>
+                <w:sz w:val="19"/>
+                <w:szCs w:val="19"/>
+              </w:rPr>
+              <w:t xml:space="preserve">Índice de Qualidade Percebida = 0,50·throughput + 0,35·estabilidade + 0,15·saúde_sessão, ×100 — indicador composto principal da aba Qualidade.</w:t>
+            </w:r>
+          </w:p>
+        </w:tc>
+      </w:tr>
+      <w:tr>
+        <w:tc>
+          <w:tcPr>
+            <w:tcW w:type="dxa" w:w="2100"/>
+            <w:tcBorders>
+              <w:top w:val="single" w:color="CCCCCC" w:sz="4"/>
+              <w:left w:val="single" w:color="CCCCCC" w:sz="4"/>
+              <w:bottom w:val="single" w:color="CCCCCC" w:sz="4"/>
+              <w:right w:val="single" w:color="CCCCCC" w:sz="4"/>
+            </w:tcBorders>
+            <w:tcMar>
+              <w:top w:type="dxa" w:w="100"/>
+              <w:left w:type="dxa" w:w="120"/>
+              <w:bottom w:type="dxa" w:w="100"/>
+              <w:right w:type="dxa" w:w="120"/>
+            </w:tcMar>
+            <w:vAlign w:val="center"/>
+          </w:tcPr>
+          <w:p>
+            <w:pPr>
+              <w:jc w:val="left"/>
+            </w:pPr>
+            <w:r>
+              <w:rPr>
+                <w:b/>
+                <w:bCs/>
+                <w:i w:val="false"/>
+                <w:iCs w:val="false"/>
+                <w:sz w:val="19"/>
+                <w:szCs w:val="19"/>
+              </w:rPr>
+              <w:t xml:space="preserve">Isolamento Digital</w:t>
+            </w:r>
+          </w:p>
+        </w:tc>
+        <w:tc>
+          <w:tcPr>
+            <w:tcW w:type="dxa" w:w="1500"/>
+            <w:tcBorders>
+              <w:top w:val="single" w:color="CCCCCC" w:sz="4"/>
+              <w:left w:val="single" w:color="CCCCCC" w:sz="4"/>
+              <w:bottom w:val="single" w:color="CCCCCC" w:sz="4"/>
+              <w:right w:val="single" w:color="CCCCCC" w:sz="4"/>
+            </w:tcBorders>
+            <w:tcMar>
+              <w:top w:type="dxa" w:w="100"/>
+              <w:left w:type="dxa" w:w="120"/>
+              <w:bottom w:type="dxa" w:w="100"/>
+              <w:right w:type="dxa" w:w="120"/>
+            </w:tcMar>
+            <w:vAlign w:val="center"/>
+          </w:tcPr>
+          <w:p>
+            <w:pPr>
+              <w:jc w:val="left"/>
+            </w:pPr>
+            <w:r>
+              <w:rPr>
+                <w:b w:val="false"/>
+                <w:bCs w:val="false"/>
+                <w:i w:val="false"/>
+                <w:iCs w:val="false"/>
+                <w:color w:val="4A6A8A"/>
+                <w:sz w:val="19"/>
+                <w:szCs w:val="19"/>
+              </w:rPr>
+              <w:t xml:space="preserve">Indicador</w:t>
+            </w:r>
+          </w:p>
+        </w:tc>
+        <w:tc>
+          <w:tcPr>
+            <w:tcW w:type="dxa" w:w="5760"/>
+            <w:tcBorders>
+              <w:top w:val="single" w:color="CCCCCC" w:sz="4"/>
+              <w:left w:val="single" w:color="CCCCCC" w:sz="4"/>
+              <w:bottom w:val="single" w:color="CCCCCC" w:sz="4"/>
+              <w:right w:val="single" w:color="CCCCCC" w:sz="4"/>
+            </w:tcBorders>
+            <w:tcMar>
+              <w:top w:type="dxa" w:w="100"/>
+              <w:left w:type="dxa" w:w="120"/>
+              <w:bottom w:type="dxa" w:w="100"/>
+              <w:right w:type="dxa" w:w="120"/>
+            </w:tcMar>
+            <w:vAlign w:val="center"/>
+          </w:tcPr>
+          <w:p>
+            <w:pPr>
+              <w:jc w:val="left"/>
+            </w:pPr>
+            <w:r>
+              <w:rPr>
+                <w:b w:val="false"/>
+                <w:bCs w:val="false"/>
+                <w:i w:val="false"/>
+                <w:iCs w:val="false"/>
+                <w:sz w:val="19"/>
+                <w:szCs w:val="19"/>
+              </w:rPr>
+              <w:t xml:space="preserve">Indicador de gap de dado (não implementado): exigiria Cell ID (CDR móvel), indisponível na arquitetura de coleta IPFIX de banda larga fixa.</w:t>
+            </w:r>
+          </w:p>
+        </w:tc>
+      </w:tr>
+      <w:tr>
+        <w:tc>
+          <w:tcPr>
+            <w:tcW w:type="dxa" w:w="2100"/>
+            <w:tcBorders>
+              <w:top w:val="single" w:color="CCCCCC" w:sz="4"/>
+              <w:left w:val="single" w:color="CCCCCC" w:sz="4"/>
+              <w:bottom w:val="single" w:color="CCCCCC" w:sz="4"/>
+              <w:right w:val="single" w:color="CCCCCC" w:sz="4"/>
+            </w:tcBorders>
+            <w:tcMar>
+              <w:top w:type="dxa" w:w="100"/>
+              <w:left w:type="dxa" w:w="120"/>
+              <w:bottom w:type="dxa" w:w="100"/>
+              <w:right w:type="dxa" w:w="120"/>
+            </w:tcMar>
+            <w:vAlign w:val="center"/>
+          </w:tcPr>
+          <w:p>
+            <w:pPr>
+              <w:jc w:val="left"/>
+            </w:pPr>
+            <w:r>
+              <w:rPr>
+                <w:b/>
+                <w:bCs/>
+                <w:i w:val="false"/>
+                <w:iCs w:val="false"/>
+                <w:sz w:val="19"/>
+                <w:szCs w:val="19"/>
+              </w:rPr>
+              <w:t xml:space="preserve">ITU-T</w:t>
+            </w:r>
+          </w:p>
+        </w:tc>
+        <w:tc>
+          <w:tcPr>
+            <w:tcW w:type="dxa" w:w="1500"/>
+            <w:tcBorders>
+              <w:top w:val="single" w:color="CCCCCC" w:sz="4"/>
+              <w:left w:val="single" w:color="CCCCCC" w:sz="4"/>
+              <w:bottom w:val="single" w:color="CCCCCC" w:sz="4"/>
+              <w:right w:val="single" w:color="CCCCCC" w:sz="4"/>
+            </w:tcBorders>
+            <w:tcMar>
+              <w:top w:type="dxa" w:w="100"/>
+              <w:left w:type="dxa" w:w="120"/>
+              <w:bottom w:type="dxa" w:w="100"/>
+              <w:right w:type="dxa" w:w="120"/>
+            </w:tcMar>
+            <w:vAlign w:val="center"/>
+          </w:tcPr>
+          <w:p>
+            <w:pPr>
+              <w:jc w:val="left"/>
+            </w:pPr>
+            <w:r>
+              <w:rPr>
+                <w:b w:val="false"/>
+                <w:bCs w:val="false"/>
+                <w:i w:val="false"/>
+                <w:iCs w:val="false"/>
+                <w:color w:val="4A6A8A"/>
+                <w:sz w:val="19"/>
+                <w:szCs w:val="19"/>
+              </w:rPr>
+              <w:t xml:space="preserve">Sigla</w:t>
+            </w:r>
+          </w:p>
+        </w:tc>
+        <w:tc>
+          <w:tcPr>
+            <w:tcW w:type="dxa" w:w="5760"/>
+            <w:tcBorders>
+              <w:top w:val="single" w:color="CCCCCC" w:sz="4"/>
+              <w:left w:val="single" w:color="CCCCCC" w:sz="4"/>
+              <w:bottom w:val="single" w:color="CCCCCC" w:sz="4"/>
+              <w:right w:val="single" w:color="CCCCCC" w:sz="4"/>
+            </w:tcBorders>
+            <w:tcMar>
+              <w:top w:type="dxa" w:w="100"/>
+              <w:left w:type="dxa" w:w="120"/>
+              <w:bottom w:type="dxa" w:w="100"/>
+              <w:right w:type="dxa" w:w="120"/>
+            </w:tcMar>
+            <w:vAlign w:val="center"/>
+          </w:tcPr>
+          <w:p>
+            <w:pPr>
+              <w:jc w:val="left"/>
+            </w:pPr>
+            <w:r>
+              <w:rPr>
+                <w:b w:val="false"/>
+                <w:bCs w:val="false"/>
+                <w:i w:val="false"/>
+                <w:iCs w:val="false"/>
+                <w:sz w:val="19"/>
+                <w:szCs w:val="19"/>
+              </w:rPr>
+              <w:t xml:space="preserve">International Telecommunication Union — Telecommunication Standardization Sector; incorporou o eTOM na série M.3050.</w:t>
+            </w:r>
+          </w:p>
+        </w:tc>
+      </w:tr>
+      <w:tr>
+        <w:tc>
+          <w:tcPr>
+            <w:tcW w:type="dxa" w:w="2100"/>
+            <w:tcBorders>
+              <w:top w:val="single" w:color="CCCCCC" w:sz="4"/>
+              <w:left w:val="single" w:color="CCCCCC" w:sz="4"/>
+              <w:bottom w:val="single" w:color="CCCCCC" w:sz="4"/>
+              <w:right w:val="single" w:color="CCCCCC" w:sz="4"/>
+            </w:tcBorders>
+            <w:tcMar>
+              <w:top w:type="dxa" w:w="100"/>
+              <w:left w:type="dxa" w:w="120"/>
+              <w:bottom w:type="dxa" w:w="100"/>
+              <w:right w:type="dxa" w:w="120"/>
+            </w:tcMar>
+            <w:vAlign w:val="center"/>
+          </w:tcPr>
+          <w:p>
+            <w:pPr>
+              <w:jc w:val="left"/>
+            </w:pPr>
+            <w:r>
+              <w:rPr>
+                <w:b/>
+                <w:bCs/>
+                <w:i w:val="false"/>
+                <w:iCs w:val="false"/>
+                <w:sz w:val="19"/>
+                <w:szCs w:val="19"/>
+              </w:rPr>
+              <w:t xml:space="preserve">JSD</w:t>
+            </w:r>
+          </w:p>
+        </w:tc>
+        <w:tc>
+          <w:tcPr>
+            <w:tcW w:type="dxa" w:w="1500"/>
+            <w:tcBorders>
+              <w:top w:val="single" w:color="CCCCCC" w:sz="4"/>
+              <w:left w:val="single" w:color="CCCCCC" w:sz="4"/>
+              <w:bottom w:val="single" w:color="CCCCCC" w:sz="4"/>
+              <w:right w:val="single" w:color="CCCCCC" w:sz="4"/>
+            </w:tcBorders>
+            <w:tcMar>
+              <w:top w:type="dxa" w:w="100"/>
+              <w:left w:type="dxa" w:w="120"/>
+              <w:bottom w:type="dxa" w:w="100"/>
+              <w:right w:type="dxa" w:w="120"/>
+            </w:tcMar>
+            <w:vAlign w:val="center"/>
+          </w:tcPr>
+          <w:p>
+            <w:pPr>
+              <w:jc w:val="left"/>
+            </w:pPr>
+            <w:r>
+              <w:rPr>
+                <w:b w:val="false"/>
+                <w:bCs w:val="false"/>
+                <w:i w:val="false"/>
+                <w:iCs w:val="false"/>
+                <w:color w:val="4A6A8A"/>
+                <w:sz w:val="19"/>
+                <w:szCs w:val="19"/>
+              </w:rPr>
+              <w:t xml:space="preserve">Modelo/Técnica</w:t>
+            </w:r>
+          </w:p>
+        </w:tc>
+        <w:tc>
+          <w:tcPr>
+            <w:tcW w:type="dxa" w:w="5760"/>
+            <w:tcBorders>
+              <w:top w:val="single" w:color="CCCCCC" w:sz="4"/>
+              <w:left w:val="single" w:color="CCCCCC" w:sz="4"/>
+              <w:bottom w:val="single" w:color="CCCCCC" w:sz="4"/>
+              <w:right w:val="single" w:color="CCCCCC" w:sz="4"/>
+            </w:tcBorders>
+            <w:tcMar>
+              <w:top w:type="dxa" w:w="100"/>
+              <w:left w:type="dxa" w:w="120"/>
+              <w:bottom w:type="dxa" w:w="100"/>
+              <w:right w:type="dxa" w:w="120"/>
+            </w:tcMar>
+            <w:vAlign w:val="center"/>
+          </w:tcPr>
+          <w:p>
+            <w:pPr>
+              <w:jc w:val="left"/>
+            </w:pPr>
+            <w:r>
+              <w:rPr>
+                <w:b w:val="false"/>
+                <w:bCs w:val="false"/>
+                <w:i w:val="false"/>
+                <w:iCs w:val="false"/>
+                <w:sz w:val="19"/>
+                <w:szCs w:val="19"/>
+              </w:rPr>
+              <w:t xml:space="preserve">Divergência de Jensen-Shannon — métrica de teoria da informação, simétrica e sempre finita, para distância entre distribuições de probabilidade; base do Sigma Topológico.</w:t>
+            </w:r>
+          </w:p>
+        </w:tc>
+      </w:tr>
+      <w:tr>
+        <w:tc>
+          <w:tcPr>
+            <w:tcW w:type="dxa" w:w="2100"/>
+            <w:tcBorders>
+              <w:top w:val="single" w:color="CCCCCC" w:sz="4"/>
+              <w:left w:val="single" w:color="CCCCCC" w:sz="4"/>
+              <w:bottom w:val="single" w:color="CCCCCC" w:sz="4"/>
+              <w:right w:val="single" w:color="CCCCCC" w:sz="4"/>
+            </w:tcBorders>
+            <w:tcMar>
+              <w:top w:type="dxa" w:w="100"/>
+              <w:left w:type="dxa" w:w="120"/>
+              <w:bottom w:type="dxa" w:w="100"/>
+              <w:right w:type="dxa" w:w="120"/>
+            </w:tcMar>
+            <w:vAlign w:val="center"/>
+          </w:tcPr>
+          <w:p>
+            <w:pPr>
+              <w:jc w:val="left"/>
+            </w:pPr>
+            <w:r>
+              <w:rPr>
+                <w:b/>
+                <w:bCs/>
+                <w:i w:val="false"/>
+                <w:iCs w:val="false"/>
+                <w:sz w:val="19"/>
+                <w:szCs w:val="19"/>
+              </w:rPr>
+              <w:t xml:space="preserve">K-Means++</w:t>
+            </w:r>
+          </w:p>
+        </w:tc>
+        <w:tc>
+          <w:tcPr>
+            <w:tcW w:type="dxa" w:w="1500"/>
+            <w:tcBorders>
+              <w:top w:val="single" w:color="CCCCCC" w:sz="4"/>
+              <w:left w:val="single" w:color="CCCCCC" w:sz="4"/>
+              <w:bottom w:val="single" w:color="CCCCCC" w:sz="4"/>
+              <w:right w:val="single" w:color="CCCCCC" w:sz="4"/>
+            </w:tcBorders>
+            <w:tcMar>
+              <w:top w:type="dxa" w:w="100"/>
+              <w:left w:type="dxa" w:w="120"/>
+              <w:bottom w:type="dxa" w:w="100"/>
+              <w:right w:type="dxa" w:w="120"/>
+            </w:tcMar>
+            <w:vAlign w:val="center"/>
+          </w:tcPr>
+          <w:p>
+            <w:pPr>
+              <w:jc w:val="left"/>
+            </w:pPr>
+            <w:r>
+              <w:rPr>
+                <w:b w:val="false"/>
+                <w:bCs w:val="false"/>
+                <w:i w:val="false"/>
+                <w:iCs w:val="false"/>
+                <w:color w:val="4A6A8A"/>
+                <w:sz w:val="19"/>
+                <w:szCs w:val="19"/>
+              </w:rPr>
+              <w:t xml:space="preserve">Modelo/Técnica</w:t>
+            </w:r>
+          </w:p>
+        </w:tc>
+        <w:tc>
+          <w:tcPr>
+            <w:tcW w:type="dxa" w:w="5760"/>
+            <w:tcBorders>
+              <w:top w:val="single" w:color="CCCCCC" w:sz="4"/>
+              <w:left w:val="single" w:color="CCCCCC" w:sz="4"/>
+              <w:bottom w:val="single" w:color="CCCCCC" w:sz="4"/>
+              <w:right w:val="single" w:color="CCCCCC" w:sz="4"/>
+            </w:tcBorders>
+            <w:tcMar>
+              <w:top w:type="dxa" w:w="100"/>
+              <w:left w:type="dxa" w:w="120"/>
+              <w:bottom w:type="dxa" w:w="100"/>
+              <w:right w:type="dxa" w:w="120"/>
+            </w:tcMar>
+            <w:vAlign w:val="center"/>
+          </w:tcPr>
+          <w:p>
+            <w:pPr>
+              <w:jc w:val="left"/>
+            </w:pPr>
+            <w:r>
+              <w:rPr>
+                <w:b w:val="false"/>
+                <w:bCs w:val="false"/>
+                <w:i w:val="false"/>
+                <w:iCs w:val="false"/>
+                <w:sz w:val="19"/>
+                <w:szCs w:val="19"/>
+              </w:rPr>
+              <w:t xml:space="preserve">Variante do K-Means com inicialização probabilística dos centróides; usada para as 8 Personas Digitais a partir de 14 features comportamentais contínuas (k=8).</w:t>
+            </w:r>
+          </w:p>
+        </w:tc>
+      </w:tr>
+      <w:tr>
+        <w:tc>
+          <w:tcPr>
+            <w:tcW w:type="dxa" w:w="2100"/>
+            <w:tcBorders>
+              <w:top w:val="single" w:color="CCCCCC" w:sz="4"/>
+              <w:left w:val="single" w:color="CCCCCC" w:sz="4"/>
+              <w:bottom w:val="single" w:color="CCCCCC" w:sz="4"/>
+              <w:right w:val="single" w:color="CCCCCC" w:sz="4"/>
+            </w:tcBorders>
+            <w:tcMar>
+              <w:top w:type="dxa" w:w="100"/>
+              <w:left w:type="dxa" w:w="120"/>
+              <w:bottom w:type="dxa" w:w="100"/>
+              <w:right w:type="dxa" w:w="120"/>
+            </w:tcMar>
+            <w:vAlign w:val="center"/>
+          </w:tcPr>
+          <w:p>
+            <w:pPr>
+              <w:jc w:val="left"/>
+            </w:pPr>
+            <w:r>
+              <w:rPr>
+                <w:b/>
+                <w:bCs/>
+                <w:i w:val="false"/>
+                <w:iCs w:val="false"/>
+                <w:sz w:val="19"/>
+                <w:szCs w:val="19"/>
+              </w:rPr>
+              <w:t xml:space="preserve">LGPD</w:t>
+            </w:r>
+          </w:p>
+        </w:tc>
+        <w:tc>
+          <w:tcPr>
+            <w:tcW w:type="dxa" w:w="1500"/>
+            <w:tcBorders>
+              <w:top w:val="single" w:color="CCCCCC" w:sz="4"/>
+              <w:left w:val="single" w:color="CCCCCC" w:sz="4"/>
+              <w:bottom w:val="single" w:color="CCCCCC" w:sz="4"/>
+              <w:right w:val="single" w:color="CCCCCC" w:sz="4"/>
+            </w:tcBorders>
+            <w:tcMar>
+              <w:top w:type="dxa" w:w="100"/>
+              <w:left w:type="dxa" w:w="120"/>
+              <w:bottom w:type="dxa" w:w="100"/>
+              <w:right w:type="dxa" w:w="120"/>
+            </w:tcMar>
+            <w:vAlign w:val="center"/>
+          </w:tcPr>
+          <w:p>
+            <w:pPr>
+              <w:jc w:val="left"/>
+            </w:pPr>
+            <w:r>
+              <w:rPr>
+                <w:b w:val="false"/>
+                <w:bCs w:val="false"/>
+                <w:i w:val="false"/>
+                <w:iCs w:val="false"/>
+                <w:color w:val="4A6A8A"/>
+                <w:sz w:val="19"/>
+                <w:szCs w:val="19"/>
+              </w:rPr>
+              <w:t xml:space="preserve">Sigla</w:t>
+            </w:r>
+          </w:p>
+        </w:tc>
+        <w:tc>
+          <w:tcPr>
+            <w:tcW w:type="dxa" w:w="5760"/>
+            <w:tcBorders>
+              <w:top w:val="single" w:color="CCCCCC" w:sz="4"/>
+              <w:left w:val="single" w:color="CCCCCC" w:sz="4"/>
+              <w:bottom w:val="single" w:color="CCCCCC" w:sz="4"/>
+              <w:right w:val="single" w:color="CCCCCC" w:sz="4"/>
+            </w:tcBorders>
+            <w:tcMar>
+              <w:top w:type="dxa" w:w="100"/>
+              <w:left w:type="dxa" w:w="120"/>
+              <w:bottom w:type="dxa" w:w="100"/>
+              <w:right w:type="dxa" w:w="120"/>
+            </w:tcMar>
+            <w:vAlign w:val="center"/>
+          </w:tcPr>
+          <w:p>
+            <w:pPr>
+              <w:jc w:val="left"/>
+            </w:pPr>
+            <w:r>
+              <w:rPr>
+                <w:b w:val="false"/>
+                <w:bCs w:val="false"/>
+                <w:i w:val="false"/>
+                <w:iCs w:val="false"/>
+                <w:sz w:val="19"/>
+                <w:szCs w:val="19"/>
+              </w:rPr>
+              <w:t xml:space="preserve">Lei Geral de Proteção de Dados (Lei nº 13.709/2018); base legal (art. 7º, incisos VI e X) da Consulta Individual de Assinante.</w:t>
+            </w:r>
+          </w:p>
+        </w:tc>
+      </w:tr>
+      <w:tr>
+        <w:tc>
+          <w:tcPr>
+            <w:tcW w:type="dxa" w:w="2100"/>
+            <w:tcBorders>
+              <w:top w:val="single" w:color="CCCCCC" w:sz="4"/>
+              <w:left w:val="single" w:color="CCCCCC" w:sz="4"/>
+              <w:bottom w:val="single" w:color="CCCCCC" w:sz="4"/>
+              <w:right w:val="single" w:color="CCCCCC" w:sz="4"/>
+            </w:tcBorders>
+            <w:tcMar>
+              <w:top w:type="dxa" w:w="100"/>
+              <w:left w:type="dxa" w:w="120"/>
+              <w:bottom w:type="dxa" w:w="100"/>
+              <w:right w:type="dxa" w:w="120"/>
+            </w:tcMar>
+            <w:vAlign w:val="center"/>
+          </w:tcPr>
+          <w:p>
+            <w:pPr>
+              <w:jc w:val="left"/>
+            </w:pPr>
+            <w:r>
+              <w:rPr>
+                <w:b/>
+                <w:bCs/>
+                <w:i w:val="false"/>
+                <w:iCs w:val="false"/>
+                <w:sz w:val="19"/>
+                <w:szCs w:val="19"/>
+              </w:rPr>
+              <w:t xml:space="preserve">Markov (Cadeia de Markov)</w:t>
+            </w:r>
+          </w:p>
+        </w:tc>
+        <w:tc>
+          <w:tcPr>
+            <w:tcW w:type="dxa" w:w="1500"/>
+            <w:tcBorders>
+              <w:top w:val="single" w:color="CCCCCC" w:sz="4"/>
+              <w:left w:val="single" w:color="CCCCCC" w:sz="4"/>
+              <w:bottom w:val="single" w:color="CCCCCC" w:sz="4"/>
+              <w:right w:val="single" w:color="CCCCCC" w:sz="4"/>
+            </w:tcBorders>
+            <w:tcMar>
+              <w:top w:type="dxa" w:w="100"/>
+              <w:left w:type="dxa" w:w="120"/>
+              <w:bottom w:type="dxa" w:w="100"/>
+              <w:right w:type="dxa" w:w="120"/>
+            </w:tcMar>
+            <w:vAlign w:val="center"/>
+          </w:tcPr>
+          <w:p>
+            <w:pPr>
+              <w:jc w:val="left"/>
+            </w:pPr>
+            <w:r>
+              <w:rPr>
+                <w:b w:val="false"/>
+                <w:bCs w:val="false"/>
+                <w:i w:val="false"/>
+                <w:iCs w:val="false"/>
+                <w:color w:val="4A6A8A"/>
+                <w:sz w:val="19"/>
+                <w:szCs w:val="19"/>
+              </w:rPr>
+              <w:t xml:space="preserve">Modelo/Técnica</w:t>
+            </w:r>
+          </w:p>
+        </w:tc>
+        <w:tc>
+          <w:tcPr>
+            <w:tcW w:type="dxa" w:w="5760"/>
+            <w:tcBorders>
+              <w:top w:val="single" w:color="CCCCCC" w:sz="4"/>
+              <w:left w:val="single" w:color="CCCCCC" w:sz="4"/>
+              <w:bottom w:val="single" w:color="CCCCCC" w:sz="4"/>
+              <w:right w:val="single" w:color="CCCCCC" w:sz="4"/>
+            </w:tcBorders>
+            <w:tcMar>
+              <w:top w:type="dxa" w:w="100"/>
+              <w:left w:type="dxa" w:w="120"/>
+              <w:bottom w:type="dxa" w:w="100"/>
+              <w:right w:type="dxa" w:w="120"/>
+            </w:tcMar>
+            <w:vAlign w:val="center"/>
+          </w:tcPr>
+          <w:p>
+            <w:pPr>
+              <w:jc w:val="left"/>
+            </w:pPr>
+            <w:r>
+              <w:rPr>
+                <w:b w:val="false"/>
+                <w:bCs w:val="false"/>
+                <w:i w:val="false"/>
+                <w:iCs w:val="false"/>
+                <w:sz w:val="19"/>
+                <w:szCs w:val="19"/>
+              </w:rPr>
+              <w:t xml:space="preserve">Matriz de transição de estados de severidade estimada por contagem real de transições observadas; base da Tendência do Painel de Alertas, real desde 02/08/2026, por persona.</w:t>
+            </w:r>
+          </w:p>
+        </w:tc>
+      </w:tr>
+      <w:tr>
+        <w:tc>
+          <w:tcPr>
+            <w:tcW w:type="dxa" w:w="2100"/>
+            <w:tcBorders>
+              <w:top w:val="single" w:color="CCCCCC" w:sz="4"/>
+              <w:left w:val="single" w:color="CCCCCC" w:sz="4"/>
+              <w:bottom w:val="single" w:color="CCCCCC" w:sz="4"/>
+              <w:right w:val="single" w:color="CCCCCC" w:sz="4"/>
+            </w:tcBorders>
+            <w:tcMar>
+              <w:top w:type="dxa" w:w="100"/>
+              <w:left w:type="dxa" w:w="120"/>
+              <w:bottom w:type="dxa" w:w="100"/>
+              <w:right w:type="dxa" w:w="120"/>
+            </w:tcMar>
+            <w:vAlign w:val="center"/>
+          </w:tcPr>
+          <w:p>
+            <w:pPr>
+              <w:jc w:val="left"/>
+            </w:pPr>
+            <w:r>
+              <w:rPr>
+                <w:b/>
+                <w:bCs/>
+                <w:i w:val="false"/>
+                <w:iCs w:val="false"/>
+                <w:sz w:val="19"/>
+                <w:szCs w:val="19"/>
+              </w:rPr>
+              <w:t xml:space="preserve">PageRank</w:t>
+            </w:r>
+          </w:p>
+        </w:tc>
+        <w:tc>
+          <w:tcPr>
+            <w:tcW w:type="dxa" w:w="1500"/>
+            <w:tcBorders>
+              <w:top w:val="single" w:color="CCCCCC" w:sz="4"/>
+              <w:left w:val="single" w:color="CCCCCC" w:sz="4"/>
+              <w:bottom w:val="single" w:color="CCCCCC" w:sz="4"/>
+              <w:right w:val="single" w:color="CCCCCC" w:sz="4"/>
+            </w:tcBorders>
+            <w:tcMar>
+              <w:top w:type="dxa" w:w="100"/>
+              <w:left w:type="dxa" w:w="120"/>
+              <w:bottom w:type="dxa" w:w="100"/>
+              <w:right w:type="dxa" w:w="120"/>
+            </w:tcMar>
+            <w:vAlign w:val="center"/>
+          </w:tcPr>
+          <w:p>
+            <w:pPr>
+              <w:jc w:val="left"/>
+            </w:pPr>
+            <w:r>
+              <w:rPr>
+                <w:b w:val="false"/>
+                <w:bCs w:val="false"/>
+                <w:i w:val="false"/>
+                <w:iCs w:val="false"/>
+                <w:color w:val="4A6A8A"/>
+                <w:sz w:val="19"/>
+                <w:szCs w:val="19"/>
+              </w:rPr>
+              <w:t xml:space="preserve">Modelo/Técnica</w:t>
+            </w:r>
+          </w:p>
+        </w:tc>
+        <w:tc>
+          <w:tcPr>
+            <w:tcW w:type="dxa" w:w="5760"/>
+            <w:tcBorders>
+              <w:top w:val="single" w:color="CCCCCC" w:sz="4"/>
+              <w:left w:val="single" w:color="CCCCCC" w:sz="4"/>
+              <w:bottom w:val="single" w:color="CCCCCC" w:sz="4"/>
+              <w:right w:val="single" w:color="CCCCCC" w:sz="4"/>
+            </w:tcBorders>
+            <w:tcMar>
+              <w:top w:type="dxa" w:w="100"/>
+              <w:left w:type="dxa" w:w="120"/>
+              <w:bottom w:type="dxa" w:w="100"/>
+              <w:right w:type="dxa" w:w="120"/>
+            </w:tcMar>
+            <w:vAlign w:val="center"/>
+          </w:tcPr>
+          <w:p>
+            <w:pPr>
+              <w:jc w:val="left"/>
+            </w:pPr>
+            <w:r>
+              <w:rPr>
+                <w:b w:val="false"/>
+                <w:bCs w:val="false"/>
+                <w:i w:val="false"/>
+                <w:iCs w:val="false"/>
+                <w:sz w:val="19"/>
+                <w:szCs w:val="19"/>
+              </w:rPr>
+              <w:t xml:space="preserve">Algoritmo de importância de nó em grafo dirigido; usado, ponderado, para classificar o papel estratégico de SVA (Ponte/Âncora/Núcleo/Satélite).</w:t>
+            </w:r>
+          </w:p>
+        </w:tc>
+      </w:tr>
+      <w:tr>
+        <w:tc>
+          <w:tcPr>
+            <w:tcW w:type="dxa" w:w="2100"/>
+            <w:tcBorders>
+              <w:top w:val="single" w:color="CCCCCC" w:sz="4"/>
+              <w:left w:val="single" w:color="CCCCCC" w:sz="4"/>
+              <w:bottom w:val="single" w:color="CCCCCC" w:sz="4"/>
+              <w:right w:val="single" w:color="CCCCCC" w:sz="4"/>
+            </w:tcBorders>
+            <w:tcMar>
+              <w:top w:type="dxa" w:w="100"/>
+              <w:left w:type="dxa" w:w="120"/>
+              <w:bottom w:type="dxa" w:w="100"/>
+              <w:right w:type="dxa" w:w="120"/>
+            </w:tcMar>
+            <w:vAlign w:val="center"/>
+          </w:tcPr>
+          <w:p>
+            <w:pPr>
+              <w:jc w:val="left"/>
+            </w:pPr>
+            <w:r>
+              <w:rPr>
+                <w:b/>
+                <w:bCs/>
+                <w:i w:val="false"/>
+                <w:iCs w:val="false"/>
+                <w:sz w:val="19"/>
+                <w:szCs w:val="19"/>
+              </w:rPr>
+              <w:t xml:space="preserve">QoE Proximal</w:t>
+            </w:r>
+          </w:p>
+        </w:tc>
+        <w:tc>
+          <w:tcPr>
+            <w:tcW w:type="dxa" w:w="1500"/>
+            <w:tcBorders>
+              <w:top w:val="single" w:color="CCCCCC" w:sz="4"/>
+              <w:left w:val="single" w:color="CCCCCC" w:sz="4"/>
+              <w:bottom w:val="single" w:color="CCCCCC" w:sz="4"/>
+              <w:right w:val="single" w:color="CCCCCC" w:sz="4"/>
+            </w:tcBorders>
+            <w:tcMar>
+              <w:top w:type="dxa" w:w="100"/>
+              <w:left w:type="dxa" w:w="120"/>
+              <w:bottom w:type="dxa" w:w="100"/>
+              <w:right w:type="dxa" w:w="120"/>
+            </w:tcMar>
+            <w:vAlign w:val="center"/>
+          </w:tcPr>
+          <w:p>
+            <w:pPr>
+              <w:jc w:val="left"/>
+            </w:pPr>
+            <w:r>
+              <w:rPr>
+                <w:b w:val="false"/>
+                <w:bCs w:val="false"/>
+                <w:i w:val="false"/>
+                <w:iCs w:val="false"/>
+                <w:color w:val="4A6A8A"/>
+                <w:sz w:val="19"/>
+                <w:szCs w:val="19"/>
+              </w:rPr>
+              <w:t xml:space="preserve">Indicador</w:t>
+            </w:r>
+          </w:p>
+        </w:tc>
+        <w:tc>
+          <w:tcPr>
+            <w:tcW w:type="dxa" w:w="5760"/>
+            <w:tcBorders>
+              <w:top w:val="single" w:color="CCCCCC" w:sz="4"/>
+              <w:left w:val="single" w:color="CCCCCC" w:sz="4"/>
+              <w:bottom w:val="single" w:color="CCCCCC" w:sz="4"/>
+              <w:right w:val="single" w:color="CCCCCC" w:sz="4"/>
+            </w:tcBorders>
+            <w:tcMar>
+              <w:top w:type="dxa" w:w="100"/>
+              <w:left w:type="dxa" w:w="120"/>
+              <w:bottom w:type="dxa" w:w="100"/>
+              <w:right w:type="dxa" w:w="120"/>
+            </w:tcMar>
+            <w:vAlign w:val="center"/>
+          </w:tcPr>
+          <w:p>
+            <w:pPr>
+              <w:jc w:val="left"/>
+            </w:pPr>
+            <w:r>
+              <w:rPr>
+                <w:b w:val="false"/>
+                <w:bCs w:val="false"/>
+                <w:i w:val="false"/>
+                <w:iCs w:val="false"/>
+                <w:sz w:val="19"/>
+                <w:szCs w:val="19"/>
+              </w:rPr>
+              <w:t xml:space="preserve">Proxy de retransmissão TCP/jitter estimados para categorias sensíveis a latência: % retransmissão TCP estimada + jitter estimado por categoria.</w:t>
+            </w:r>
+          </w:p>
+        </w:tc>
+      </w:tr>
+      <w:tr>
+        <w:tc>
+          <w:tcPr>
+            <w:tcW w:type="dxa" w:w="2100"/>
+            <w:tcBorders>
+              <w:top w:val="single" w:color="CCCCCC" w:sz="4"/>
+              <w:left w:val="single" w:color="CCCCCC" w:sz="4"/>
+              <w:bottom w:val="single" w:color="CCCCCC" w:sz="4"/>
+              <w:right w:val="single" w:color="CCCCCC" w:sz="4"/>
+            </w:tcBorders>
+            <w:tcMar>
+              <w:top w:type="dxa" w:w="100"/>
+              <w:left w:type="dxa" w:w="120"/>
+              <w:bottom w:type="dxa" w:w="100"/>
+              <w:right w:type="dxa" w:w="120"/>
+            </w:tcMar>
+            <w:vAlign w:val="center"/>
+          </w:tcPr>
+          <w:p>
+            <w:pPr>
+              <w:jc w:val="left"/>
+            </w:pPr>
+            <w:r>
+              <w:rPr>
+                <w:b/>
+                <w:bCs/>
+                <w:i w:val="false"/>
+                <w:iCs w:val="false"/>
+                <w:sz w:val="19"/>
+                <w:szCs w:val="19"/>
+              </w:rPr>
+              <w:t xml:space="preserve">RADIUS Accounting</w:t>
+            </w:r>
+          </w:p>
+        </w:tc>
+        <w:tc>
+          <w:tcPr>
+            <w:tcW w:type="dxa" w:w="1500"/>
+            <w:tcBorders>
+              <w:top w:val="single" w:color="CCCCCC" w:sz="4"/>
+              <w:left w:val="single" w:color="CCCCCC" w:sz="4"/>
+              <w:bottom w:val="single" w:color="CCCCCC" w:sz="4"/>
+              <w:right w:val="single" w:color="CCCCCC" w:sz="4"/>
+            </w:tcBorders>
+            <w:tcMar>
+              <w:top w:type="dxa" w:w="100"/>
+              <w:left w:type="dxa" w:w="120"/>
+              <w:bottom w:type="dxa" w:w="100"/>
+              <w:right w:type="dxa" w:w="120"/>
+            </w:tcMar>
+            <w:vAlign w:val="center"/>
+          </w:tcPr>
+          <w:p>
+            <w:pPr>
+              <w:jc w:val="left"/>
+            </w:pPr>
+            <w:r>
+              <w:rPr>
+                <w:b w:val="false"/>
+                <w:bCs w:val="false"/>
+                <w:i w:val="false"/>
+                <w:iCs w:val="false"/>
+                <w:color w:val="4A6A8A"/>
+                <w:sz w:val="19"/>
+                <w:szCs w:val="19"/>
+              </w:rPr>
+              <w:t xml:space="preserve">Sigla</w:t>
+            </w:r>
+          </w:p>
+        </w:tc>
+        <w:tc>
+          <w:tcPr>
+            <w:tcW w:type="dxa" w:w="5760"/>
+            <w:tcBorders>
+              <w:top w:val="single" w:color="CCCCCC" w:sz="4"/>
+              <w:left w:val="single" w:color="CCCCCC" w:sz="4"/>
+              <w:bottom w:val="single" w:color="CCCCCC" w:sz="4"/>
+              <w:right w:val="single" w:color="CCCCCC" w:sz="4"/>
+            </w:tcBorders>
+            <w:tcMar>
+              <w:top w:type="dxa" w:w="100"/>
+              <w:left w:type="dxa" w:w="120"/>
+              <w:bottom w:type="dxa" w:w="100"/>
+              <w:right w:type="dxa" w:w="120"/>
+            </w:tcMar>
+            <w:vAlign w:val="center"/>
+          </w:tcPr>
+          <w:p>
+            <w:pPr>
+              <w:jc w:val="left"/>
+            </w:pPr>
+            <w:r>
+              <w:rPr>
+                <w:b w:val="false"/>
+                <w:bCs w:val="false"/>
+                <w:i w:val="false"/>
+                <w:iCs w:val="false"/>
+                <w:sz w:val="19"/>
+                <w:szCs w:val="19"/>
+              </w:rPr>
+              <w:t xml:space="preserve">Protocolo de contabilização de sessão de acesso PPPoE/IPoE (RFC 2866) — uma das duas fontes de dado nativas do produto (404.379 sessões na base de referência).</w:t>
+            </w:r>
+          </w:p>
+        </w:tc>
+      </w:tr>
+      <w:tr>
+        <w:tc>
+          <w:tcPr>
+            <w:tcW w:type="dxa" w:w="2100"/>
+            <w:tcBorders>
+              <w:top w:val="single" w:color="CCCCCC" w:sz="4"/>
+              <w:left w:val="single" w:color="CCCCCC" w:sz="4"/>
+              <w:bottom w:val="single" w:color="CCCCCC" w:sz="4"/>
+              <w:right w:val="single" w:color="CCCCCC" w:sz="4"/>
+            </w:tcBorders>
+            <w:tcMar>
+              <w:top w:type="dxa" w:w="100"/>
+              <w:left w:type="dxa" w:w="120"/>
+              <w:bottom w:type="dxa" w:w="100"/>
+              <w:right w:type="dxa" w:w="120"/>
+            </w:tcMar>
+            <w:vAlign w:val="center"/>
+          </w:tcPr>
+          <w:p>
+            <w:pPr>
+              <w:jc w:val="left"/>
+            </w:pPr>
+            <w:r>
+              <w:rPr>
+                <w:b/>
+                <w:bCs/>
+                <w:i w:val="false"/>
+                <w:iCs w:val="false"/>
+                <w:sz w:val="19"/>
+                <w:szCs w:val="19"/>
+              </w:rPr>
+              <w:t xml:space="preserve">RAG / SLM</w:t>
+            </w:r>
+          </w:p>
+        </w:tc>
+        <w:tc>
+          <w:tcPr>
+            <w:tcW w:type="dxa" w:w="1500"/>
+            <w:tcBorders>
+              <w:top w:val="single" w:color="CCCCCC" w:sz="4"/>
+              <w:left w:val="single" w:color="CCCCCC" w:sz="4"/>
+              <w:bottom w:val="single" w:color="CCCCCC" w:sz="4"/>
+              <w:right w:val="single" w:color="CCCCCC" w:sz="4"/>
+            </w:tcBorders>
+            <w:tcMar>
+              <w:top w:type="dxa" w:w="100"/>
+              <w:left w:type="dxa" w:w="120"/>
+              <w:bottom w:type="dxa" w:w="100"/>
+              <w:right w:type="dxa" w:w="120"/>
+            </w:tcMar>
+            <w:vAlign w:val="center"/>
+          </w:tcPr>
+          <w:p>
+            <w:pPr>
+              <w:jc w:val="left"/>
+            </w:pPr>
+            <w:r>
+              <w:rPr>
+                <w:b w:val="false"/>
+                <w:bCs w:val="false"/>
+                <w:i w:val="false"/>
+                <w:iCs w:val="false"/>
+                <w:color w:val="4A6A8A"/>
+                <w:sz w:val="19"/>
+                <w:szCs w:val="19"/>
+              </w:rPr>
+              <w:t xml:space="preserve">Sigla</w:t>
+            </w:r>
+          </w:p>
+        </w:tc>
+        <w:tc>
+          <w:tcPr>
+            <w:tcW w:type="dxa" w:w="5760"/>
+            <w:tcBorders>
+              <w:top w:val="single" w:color="CCCCCC" w:sz="4"/>
+              <w:left w:val="single" w:color="CCCCCC" w:sz="4"/>
+              <w:bottom w:val="single" w:color="CCCCCC" w:sz="4"/>
+              <w:right w:val="single" w:color="CCCCCC" w:sz="4"/>
+            </w:tcBorders>
+            <w:tcMar>
+              <w:top w:type="dxa" w:w="100"/>
+              <w:left w:type="dxa" w:w="120"/>
+              <w:bottom w:type="dxa" w:w="100"/>
+              <w:right w:type="dxa" w:w="120"/>
+            </w:tcMar>
+            <w:vAlign w:val="center"/>
+          </w:tcPr>
+          <w:p>
+            <w:pPr>
+              <w:jc w:val="left"/>
+            </w:pPr>
+            <w:r>
+              <w:rPr>
+                <w:b w:val="false"/>
+                <w:bCs w:val="false"/>
+                <w:i w:val="false"/>
+                <w:iCs w:val="false"/>
+                <w:sz w:val="19"/>
+                <w:szCs w:val="19"/>
+              </w:rPr>
+              <w:t xml:space="preserve">Retrieval-Augmented Generation / Small Language Model — nome do padrão que o Assistente do produto declara seguir; implementação real é mock por busca lexical por palavras-chave, sem embeddings nem LLM real.</w:t>
+            </w:r>
+          </w:p>
+        </w:tc>
+      </w:tr>
+      <w:tr>
+        <w:tc>
+          <w:tcPr>
+            <w:tcW w:type="dxa" w:w="2100"/>
+            <w:tcBorders>
+              <w:top w:val="single" w:color="CCCCCC" w:sz="4"/>
+              <w:left w:val="single" w:color="CCCCCC" w:sz="4"/>
+              <w:bottom w:val="single" w:color="CCCCCC" w:sz="4"/>
+              <w:right w:val="single" w:color="CCCCCC" w:sz="4"/>
+            </w:tcBorders>
+            <w:tcMar>
+              <w:top w:type="dxa" w:w="100"/>
+              <w:left w:type="dxa" w:w="120"/>
+              <w:bottom w:type="dxa" w:w="100"/>
+              <w:right w:type="dxa" w:w="120"/>
+            </w:tcMar>
+            <w:vAlign w:val="center"/>
+          </w:tcPr>
+          <w:p>
+            <w:pPr>
+              <w:jc w:val="left"/>
+            </w:pPr>
+            <w:r>
+              <w:rPr>
+                <w:b/>
+                <w:bCs/>
+                <w:i w:val="false"/>
+                <w:iCs w:val="false"/>
+                <w:sz w:val="19"/>
+                <w:szCs w:val="19"/>
+              </w:rPr>
+              <w:t xml:space="preserve">Score de Menoridade</w:t>
+            </w:r>
+          </w:p>
+        </w:tc>
+        <w:tc>
+          <w:tcPr>
+            <w:tcW w:type="dxa" w:w="1500"/>
+            <w:tcBorders>
+              <w:top w:val="single" w:color="CCCCCC" w:sz="4"/>
+              <w:left w:val="single" w:color="CCCCCC" w:sz="4"/>
+              <w:bottom w:val="single" w:color="CCCCCC" w:sz="4"/>
+              <w:right w:val="single" w:color="CCCCCC" w:sz="4"/>
+            </w:tcBorders>
+            <w:tcMar>
+              <w:top w:type="dxa" w:w="100"/>
+              <w:left w:type="dxa" w:w="120"/>
+              <w:bottom w:type="dxa" w:w="100"/>
+              <w:right w:type="dxa" w:w="120"/>
+            </w:tcMar>
+            <w:vAlign w:val="center"/>
+          </w:tcPr>
+          <w:p>
+            <w:pPr>
+              <w:jc w:val="left"/>
+            </w:pPr>
+            <w:r>
+              <w:rPr>
+                <w:b w:val="false"/>
+                <w:bCs w:val="false"/>
+                <w:i w:val="false"/>
+                <w:iCs w:val="false"/>
+                <w:color w:val="4A6A8A"/>
+                <w:sz w:val="19"/>
+                <w:szCs w:val="19"/>
+              </w:rPr>
+              <w:t xml:space="preserve">Indicador</w:t>
+            </w:r>
+          </w:p>
+        </w:tc>
+        <w:tc>
+          <w:tcPr>
+            <w:tcW w:type="dxa" w:w="5760"/>
+            <w:tcBorders>
+              <w:top w:val="single" w:color="CCCCCC" w:sz="4"/>
+              <w:left w:val="single" w:color="CCCCCC" w:sz="4"/>
+              <w:bottom w:val="single" w:color="CCCCCC" w:sz="4"/>
+              <w:right w:val="single" w:color="CCCCCC" w:sz="4"/>
+            </w:tcBorders>
+            <w:tcMar>
+              <w:top w:type="dxa" w:w="100"/>
+              <w:left w:type="dxa" w:w="120"/>
+              <w:bottom w:type="dxa" w:w="100"/>
+              <w:right w:type="dxa" w:w="120"/>
+            </w:tcMar>
+            <w:vAlign w:val="center"/>
+          </w:tcPr>
+          <w:p>
+            <w:pPr>
+              <w:jc w:val="left"/>
+            </w:pPr>
+            <w:r>
+              <w:rPr>
+                <w:b w:val="false"/>
+                <w:bCs w:val="false"/>
+                <w:i w:val="false"/>
+                <w:iCs w:val="false"/>
+                <w:sz w:val="19"/>
+                <w:szCs w:val="19"/>
+              </w:rPr>
+              <w:t xml:space="preserve">Padrão compatível com uso infanto-juvenil no domicílio: 45% mix social/gaming vs. trabalho/voip + 35% padrão 15h–21h + 20% D/U; ≥60 aciona ClassInd.</w:t>
+            </w:r>
+          </w:p>
+        </w:tc>
+      </w:tr>
+      <w:tr>
+        <w:tc>
+          <w:tcPr>
+            <w:tcW w:type="dxa" w:w="2100"/>
+            <w:tcBorders>
+              <w:top w:val="single" w:color="CCCCCC" w:sz="4"/>
+              <w:left w:val="single" w:color="CCCCCC" w:sz="4"/>
+              <w:bottom w:val="single" w:color="CCCCCC" w:sz="4"/>
+              <w:right w:val="single" w:color="CCCCCC" w:sz="4"/>
+            </w:tcBorders>
+            <w:tcMar>
+              <w:top w:type="dxa" w:w="100"/>
+              <w:left w:type="dxa" w:w="120"/>
+              <w:bottom w:type="dxa" w:w="100"/>
+              <w:right w:type="dxa" w:w="120"/>
+            </w:tcMar>
+            <w:vAlign w:val="center"/>
+          </w:tcPr>
+          <w:p>
+            <w:pPr>
+              <w:jc w:val="left"/>
+            </w:pPr>
+            <w:r>
+              <w:rPr>
+                <w:b/>
+                <w:bCs/>
+                <w:i w:val="false"/>
+                <w:iCs w:val="false"/>
+                <w:sz w:val="19"/>
+                <w:szCs w:val="19"/>
+              </w:rPr>
+              <w:t xml:space="preserve">Sigma Topológico (σ)</w:t>
+            </w:r>
+          </w:p>
+        </w:tc>
+        <w:tc>
+          <w:tcPr>
+            <w:tcW w:type="dxa" w:w="1500"/>
+            <w:tcBorders>
+              <w:top w:val="single" w:color="CCCCCC" w:sz="4"/>
+              <w:left w:val="single" w:color="CCCCCC" w:sz="4"/>
+              <w:bottom w:val="single" w:color="CCCCCC" w:sz="4"/>
+              <w:right w:val="single" w:color="CCCCCC" w:sz="4"/>
+            </w:tcBorders>
+            <w:tcMar>
+              <w:top w:type="dxa" w:w="100"/>
+              <w:left w:type="dxa" w:w="120"/>
+              <w:bottom w:type="dxa" w:w="100"/>
+              <w:right w:type="dxa" w:w="120"/>
+            </w:tcMar>
+            <w:vAlign w:val="center"/>
+          </w:tcPr>
+          <w:p>
+            <w:pPr>
+              <w:jc w:val="left"/>
+            </w:pPr>
+            <w:r>
+              <w:rPr>
+                <w:b w:val="false"/>
+                <w:bCs w:val="false"/>
+                <w:i w:val="false"/>
+                <w:iCs w:val="false"/>
+                <w:color w:val="4A6A8A"/>
+                <w:sz w:val="19"/>
+                <w:szCs w:val="19"/>
+              </w:rPr>
+              <w:t xml:space="preserve">Indicador</w:t>
+            </w:r>
+          </w:p>
+        </w:tc>
+        <w:tc>
+          <w:tcPr>
+            <w:tcW w:type="dxa" w:w="5760"/>
+            <w:tcBorders>
+              <w:top w:val="single" w:color="CCCCCC" w:sz="4"/>
+              <w:left w:val="single" w:color="CCCCCC" w:sz="4"/>
+              <w:bottom w:val="single" w:color="CCCCCC" w:sz="4"/>
+              <w:right w:val="single" w:color="CCCCCC" w:sz="4"/>
+            </w:tcBorders>
+            <w:tcMar>
+              <w:top w:type="dxa" w:w="100"/>
+              <w:left w:type="dxa" w:w="120"/>
+              <w:bottom w:type="dxa" w:w="100"/>
+              <w:right w:type="dxa" w:w="120"/>
+            </w:tcMar>
+            <w:vAlign w:val="center"/>
+          </w:tcPr>
+          <w:p>
+            <w:pPr>
+              <w:jc w:val="left"/>
+            </w:pPr>
+            <w:r>
+              <w:rPr>
+                <w:b w:val="false"/>
+                <w:bCs w:val="false"/>
+                <w:i w:val="false"/>
+                <w:iCs w:val="false"/>
+                <w:sz w:val="19"/>
+                <w:szCs w:val="19"/>
+              </w:rPr>
+              <w:t xml:space="preserve">Variação estrutural do dígrafo de jornada entre dois períodos: σ = 0,6·JSD(Pt,Pt+1) + 0,4·Δarestas(t,t+1).</w:t>
+            </w:r>
+          </w:p>
+        </w:tc>
+      </w:tr>
+      <w:tr>
+        <w:tc>
+          <w:tcPr>
+            <w:tcW w:type="dxa" w:w="2100"/>
+            <w:tcBorders>
+              <w:top w:val="single" w:color="CCCCCC" w:sz="4"/>
+              <w:left w:val="single" w:color="CCCCCC" w:sz="4"/>
+              <w:bottom w:val="single" w:color="CCCCCC" w:sz="4"/>
+              <w:right w:val="single" w:color="CCCCCC" w:sz="4"/>
+            </w:tcBorders>
+            <w:tcMar>
+              <w:top w:type="dxa" w:w="100"/>
+              <w:left w:type="dxa" w:w="120"/>
+              <w:bottom w:type="dxa" w:w="100"/>
+              <w:right w:type="dxa" w:w="120"/>
+            </w:tcMar>
+            <w:vAlign w:val="center"/>
+          </w:tcPr>
+          <w:p>
+            <w:pPr>
+              <w:jc w:val="left"/>
+            </w:pPr>
+            <w:r>
+              <w:rPr>
+                <w:b/>
+                <w:bCs/>
+                <w:i w:val="false"/>
+                <w:iCs w:val="false"/>
+                <w:sz w:val="19"/>
+                <w:szCs w:val="19"/>
+              </w:rPr>
+              <w:t xml:space="preserve">SLA</w:t>
+            </w:r>
+          </w:p>
+        </w:tc>
+        <w:tc>
+          <w:tcPr>
+            <w:tcW w:type="dxa" w:w="1500"/>
+            <w:tcBorders>
+              <w:top w:val="single" w:color="CCCCCC" w:sz="4"/>
+              <w:left w:val="single" w:color="CCCCCC" w:sz="4"/>
+              <w:bottom w:val="single" w:color="CCCCCC" w:sz="4"/>
+              <w:right w:val="single" w:color="CCCCCC" w:sz="4"/>
+            </w:tcBorders>
+            <w:tcMar>
+              <w:top w:type="dxa" w:w="100"/>
+              <w:left w:type="dxa" w:w="120"/>
+              <w:bottom w:type="dxa" w:w="100"/>
+              <w:right w:type="dxa" w:w="120"/>
+            </w:tcMar>
+            <w:vAlign w:val="center"/>
+          </w:tcPr>
+          <w:p>
+            <w:pPr>
+              <w:jc w:val="left"/>
+            </w:pPr>
+            <w:r>
+              <w:rPr>
+                <w:b w:val="false"/>
+                <w:bCs w:val="false"/>
+                <w:i w:val="false"/>
+                <w:iCs w:val="false"/>
+                <w:color w:val="4A6A8A"/>
+                <w:sz w:val="19"/>
+                <w:szCs w:val="19"/>
+              </w:rPr>
+              <w:t xml:space="preserve">Sigla</w:t>
+            </w:r>
+          </w:p>
+        </w:tc>
+        <w:tc>
+          <w:tcPr>
+            <w:tcW w:type="dxa" w:w="5760"/>
+            <w:tcBorders>
+              <w:top w:val="single" w:color="CCCCCC" w:sz="4"/>
+              <w:left w:val="single" w:color="CCCCCC" w:sz="4"/>
+              <w:bottom w:val="single" w:color="CCCCCC" w:sz="4"/>
+              <w:right w:val="single" w:color="CCCCCC" w:sz="4"/>
+            </w:tcBorders>
+            <w:tcMar>
+              <w:top w:type="dxa" w:w="100"/>
+              <w:left w:type="dxa" w:w="120"/>
+              <w:bottom w:type="dxa" w:w="100"/>
+              <w:right w:type="dxa" w:w="120"/>
+            </w:tcMar>
+            <w:vAlign w:val="center"/>
+          </w:tcPr>
+          <w:p>
+            <w:pPr>
+              <w:jc w:val="left"/>
+            </w:pPr>
+            <w:r>
+              <w:rPr>
+                <w:b w:val="false"/>
+                <w:bCs w:val="false"/>
+                <w:i w:val="false"/>
+                <w:iCs w:val="false"/>
+                <w:sz w:val="19"/>
+                <w:szCs w:val="19"/>
+              </w:rPr>
+              <w:t xml:space="preserve">Service Level Agreement — acordo de nível de serviço; uma das três hipóteses de uso nomeadas da Consulta Individual (manutenção sob SLA de NOC).</w:t>
+            </w:r>
+          </w:p>
+        </w:tc>
+      </w:tr>
+      <w:tr>
+        <w:tc>
+          <w:tcPr>
+            <w:tcW w:type="dxa" w:w="2100"/>
+            <w:tcBorders>
+              <w:top w:val="single" w:color="CCCCCC" w:sz="4"/>
+              <w:left w:val="single" w:color="CCCCCC" w:sz="4"/>
+              <w:bottom w:val="single" w:color="CCCCCC" w:sz="4"/>
+              <w:right w:val="single" w:color="CCCCCC" w:sz="4"/>
+            </w:tcBorders>
+            <w:tcMar>
+              <w:top w:type="dxa" w:w="100"/>
+              <w:left w:type="dxa" w:w="120"/>
+              <w:bottom w:type="dxa" w:w="100"/>
+              <w:right w:type="dxa" w:w="120"/>
+            </w:tcMar>
+            <w:vAlign w:val="center"/>
+          </w:tcPr>
+          <w:p>
+            <w:pPr>
+              <w:jc w:val="left"/>
+            </w:pPr>
+            <w:r>
+              <w:rPr>
+                <w:b/>
+                <w:bCs/>
+                <w:i w:val="false"/>
+                <w:iCs w:val="false"/>
+                <w:sz w:val="19"/>
+                <w:szCs w:val="19"/>
+              </w:rPr>
+              <w:t xml:space="preserve">SVA</w:t>
+            </w:r>
+          </w:p>
+        </w:tc>
+        <w:tc>
+          <w:tcPr>
+            <w:tcW w:type="dxa" w:w="1500"/>
+            <w:tcBorders>
+              <w:top w:val="single" w:color="CCCCCC" w:sz="4"/>
+              <w:left w:val="single" w:color="CCCCCC" w:sz="4"/>
+              <w:bottom w:val="single" w:color="CCCCCC" w:sz="4"/>
+              <w:right w:val="single" w:color="CCCCCC" w:sz="4"/>
+            </w:tcBorders>
+            <w:tcMar>
+              <w:top w:type="dxa" w:w="100"/>
+              <w:left w:type="dxa" w:w="120"/>
+              <w:bottom w:type="dxa" w:w="100"/>
+              <w:right w:type="dxa" w:w="120"/>
+            </w:tcMar>
+            <w:vAlign w:val="center"/>
+          </w:tcPr>
+          <w:p>
+            <w:pPr>
+              <w:jc w:val="left"/>
+            </w:pPr>
+            <w:r>
+              <w:rPr>
+                <w:b w:val="false"/>
+                <w:bCs w:val="false"/>
+                <w:i w:val="false"/>
+                <w:iCs w:val="false"/>
+                <w:color w:val="4A6A8A"/>
+                <w:sz w:val="19"/>
+                <w:szCs w:val="19"/>
+              </w:rPr>
+              <w:t xml:space="preserve">Sigla</w:t>
+            </w:r>
+          </w:p>
+        </w:tc>
+        <w:tc>
+          <w:tcPr>
+            <w:tcW w:type="dxa" w:w="5760"/>
+            <w:tcBorders>
+              <w:top w:val="single" w:color="CCCCCC" w:sz="4"/>
+              <w:left w:val="single" w:color="CCCCCC" w:sz="4"/>
+              <w:bottom w:val="single" w:color="CCCCCC" w:sz="4"/>
+              <w:right w:val="single" w:color="CCCCCC" w:sz="4"/>
+            </w:tcBorders>
+            <w:tcMar>
+              <w:top w:type="dxa" w:w="100"/>
+              <w:left w:type="dxa" w:w="120"/>
+              <w:bottom w:type="dxa" w:w="100"/>
+              <w:right w:type="dxa" w:w="120"/>
+            </w:tcMar>
+            <w:vAlign w:val="center"/>
+          </w:tcPr>
+          <w:p>
+            <w:pPr>
+              <w:jc w:val="left"/>
+            </w:pPr>
+            <w:r>
+              <w:rPr>
+                <w:b w:val="false"/>
+                <w:bCs w:val="false"/>
+                <w:i w:val="false"/>
+                <w:iCs w:val="false"/>
+                <w:sz w:val="19"/>
+                <w:szCs w:val="19"/>
+              </w:rPr>
+              <w:t xml:space="preserve">Serviço de Valor Agregado — serviço adicional consumido pelo assinante (streaming, gaming etc.), classificado por papel estratégico (Ponte/Âncora/Núcleo/Satélite).</w:t>
+            </w:r>
+          </w:p>
+        </w:tc>
+      </w:tr>
+      <w:tr>
+        <w:tc>
+          <w:tcPr>
+            <w:tcW w:type="dxa" w:w="2100"/>
+            <w:tcBorders>
+              <w:top w:val="single" w:color="CCCCCC" w:sz="4"/>
+              <w:left w:val="single" w:color="CCCCCC" w:sz="4"/>
+              <w:bottom w:val="single" w:color="CCCCCC" w:sz="4"/>
+              <w:right w:val="single" w:color="CCCCCC" w:sz="4"/>
+            </w:tcBorders>
+            <w:tcMar>
+              <w:top w:type="dxa" w:w="100"/>
+              <w:left w:type="dxa" w:w="120"/>
+              <w:bottom w:type="dxa" w:w="100"/>
+              <w:right w:type="dxa" w:w="120"/>
+            </w:tcMar>
+            <w:vAlign w:val="center"/>
+          </w:tcPr>
+          <w:p>
+            <w:pPr>
+              <w:jc w:val="left"/>
+            </w:pPr>
+            <w:r>
+              <w:rPr>
+                <w:b/>
+                <w:bCs/>
+                <w:i w:val="false"/>
+                <w:iCs w:val="false"/>
+                <w:sz w:val="19"/>
+                <w:szCs w:val="19"/>
+              </w:rPr>
+              <w:t xml:space="preserve">Taxa de Queda de Sessão</w:t>
+            </w:r>
+          </w:p>
+        </w:tc>
+        <w:tc>
+          <w:tcPr>
+            <w:tcW w:type="dxa" w:w="1500"/>
+            <w:tcBorders>
+              <w:top w:val="single" w:color="CCCCCC" w:sz="4"/>
+              <w:left w:val="single" w:color="CCCCCC" w:sz="4"/>
+              <w:bottom w:val="single" w:color="CCCCCC" w:sz="4"/>
+              <w:right w:val="single" w:color="CCCCCC" w:sz="4"/>
+            </w:tcBorders>
+            <w:tcMar>
+              <w:top w:type="dxa" w:w="100"/>
+              <w:left w:type="dxa" w:w="120"/>
+              <w:bottom w:type="dxa" w:w="100"/>
+              <w:right w:type="dxa" w:w="120"/>
+            </w:tcMar>
+            <w:vAlign w:val="center"/>
+          </w:tcPr>
+          <w:p>
+            <w:pPr>
+              <w:jc w:val="left"/>
+            </w:pPr>
+            <w:r>
+              <w:rPr>
+                <w:b w:val="false"/>
+                <w:bCs w:val="false"/>
+                <w:i w:val="false"/>
+                <w:iCs w:val="false"/>
+                <w:color w:val="4A6A8A"/>
+                <w:sz w:val="19"/>
+                <w:szCs w:val="19"/>
+              </w:rPr>
+              <w:t xml:space="preserve">Indicador</w:t>
+            </w:r>
+          </w:p>
+        </w:tc>
+        <w:tc>
+          <w:tcPr>
+            <w:tcW w:type="dxa" w:w="5760"/>
+            <w:tcBorders>
+              <w:top w:val="single" w:color="CCCCCC" w:sz="4"/>
+              <w:left w:val="single" w:color="CCCCCC" w:sz="4"/>
+              <w:bottom w:val="single" w:color="CCCCCC" w:sz="4"/>
+              <w:right w:val="single" w:color="CCCCCC" w:sz="4"/>
+            </w:tcBorders>
+            <w:tcMar>
+              <w:top w:type="dxa" w:w="100"/>
+              <w:left w:type="dxa" w:w="120"/>
+              <w:bottom w:type="dxa" w:w="100"/>
+              <w:right w:type="dxa" w:w="120"/>
+            </w:tcMar>
+            <w:vAlign w:val="center"/>
+          </w:tcPr>
+          <w:p>
+            <w:pPr>
+              <w:jc w:val="left"/>
+            </w:pPr>
+            <w:r>
+              <w:rPr>
+                <w:b w:val="false"/>
+                <w:bCs w:val="false"/>
+                <w:i w:val="false"/>
+                <w:iCs w:val="false"/>
+                <w:sz w:val="19"/>
+                <w:szCs w:val="19"/>
+              </w:rPr>
+              <w:t xml:space="preserve">% de sessões terminadas por Lost-Carrier (Acct-Terminate-Cause), por NAS/segmento; 100% extraível do RADIUS já coletado.</w:t>
+            </w:r>
+          </w:p>
+        </w:tc>
+      </w:tr>
+      <w:tr>
+        <w:tc>
+          <w:tcPr>
+            <w:tcW w:type="dxa" w:w="2100"/>
+            <w:tcBorders>
+              <w:top w:val="single" w:color="CCCCCC" w:sz="4"/>
+              <w:left w:val="single" w:color="CCCCCC" w:sz="4"/>
+              <w:bottom w:val="single" w:color="CCCCCC" w:sz="4"/>
+              <w:right w:val="single" w:color="CCCCCC" w:sz="4"/>
+            </w:tcBorders>
+            <w:tcMar>
+              <w:top w:type="dxa" w:w="100"/>
+              <w:left w:type="dxa" w:w="120"/>
+              <w:bottom w:type="dxa" w:w="100"/>
+              <w:right w:type="dxa" w:w="120"/>
+            </w:tcMar>
+            <w:vAlign w:val="center"/>
+          </w:tcPr>
+          <w:p>
+            <w:pPr>
+              <w:jc w:val="left"/>
+            </w:pPr>
+            <w:r>
+              <w:rPr>
+                <w:b/>
+                <w:bCs/>
+                <w:i w:val="false"/>
+                <w:iCs w:val="false"/>
+                <w:sz w:val="19"/>
+                <w:szCs w:val="19"/>
+              </w:rPr>
+              <w:t xml:space="preserve">TM Forum</w:t>
+            </w:r>
+          </w:p>
+        </w:tc>
+        <w:tc>
+          <w:tcPr>
+            <w:tcW w:type="dxa" w:w="1500"/>
+            <w:tcBorders>
+              <w:top w:val="single" w:color="CCCCCC" w:sz="4"/>
+              <w:left w:val="single" w:color="CCCCCC" w:sz="4"/>
+              <w:bottom w:val="single" w:color="CCCCCC" w:sz="4"/>
+              <w:right w:val="single" w:color="CCCCCC" w:sz="4"/>
+            </w:tcBorders>
+            <w:tcMar>
+              <w:top w:type="dxa" w:w="100"/>
+              <w:left w:type="dxa" w:w="120"/>
+              <w:bottom w:type="dxa" w:w="100"/>
+              <w:right w:type="dxa" w:w="120"/>
+            </w:tcMar>
+            <w:vAlign w:val="center"/>
+          </w:tcPr>
+          <w:p>
+            <w:pPr>
+              <w:jc w:val="left"/>
+            </w:pPr>
+            <w:r>
+              <w:rPr>
+                <w:b w:val="false"/>
+                <w:bCs w:val="false"/>
+                <w:i w:val="false"/>
+                <w:iCs w:val="false"/>
+                <w:color w:val="4A6A8A"/>
+                <w:sz w:val="19"/>
+                <w:szCs w:val="19"/>
+              </w:rPr>
+              <w:t xml:space="preserve">Sigla</w:t>
+            </w:r>
+          </w:p>
+        </w:tc>
+        <w:tc>
+          <w:tcPr>
+            <w:tcW w:type="dxa" w:w="5760"/>
+            <w:tcBorders>
+              <w:top w:val="single" w:color="CCCCCC" w:sz="4"/>
+              <w:left w:val="single" w:color="CCCCCC" w:sz="4"/>
+              <w:bottom w:val="single" w:color="CCCCCC" w:sz="4"/>
+              <w:right w:val="single" w:color="CCCCCC" w:sz="4"/>
+            </w:tcBorders>
+            <w:tcMar>
+              <w:top w:type="dxa" w:w="100"/>
+              <w:left w:type="dxa" w:w="120"/>
+              <w:bottom w:type="dxa" w:w="100"/>
+              <w:right w:type="dxa" w:w="120"/>
+            </w:tcMar>
+            <w:vAlign w:val="center"/>
+          </w:tcPr>
+          <w:p>
+            <w:pPr>
+              <w:jc w:val="left"/>
+            </w:pPr>
+            <w:r>
+              <w:rPr>
+                <w:b w:val="false"/>
+                <w:bCs w:val="false"/>
+                <w:i w:val="false"/>
+                <w:iCs w:val="false"/>
+                <w:sz w:val="19"/>
+                <w:szCs w:val="19"/>
+              </w:rPr>
+              <w:t xml:space="preserve">TeleManagement Forum — origem do eTOM (GB921) e do Big Data Analytics Guidebook (GB979), referenciado na Base Metodológica.</w:t>
+            </w:r>
+          </w:p>
+        </w:tc>
+      </w:tr>
+      <w:tr>
+        <w:tc>
+          <w:tcPr>
+            <w:tcW w:type="dxa" w:w="2100"/>
+            <w:tcBorders>
+              <w:top w:val="single" w:color="CCCCCC" w:sz="4"/>
+              <w:left w:val="single" w:color="CCCCCC" w:sz="4"/>
+              <w:bottom w:val="single" w:color="CCCCCC" w:sz="4"/>
+              <w:right w:val="single" w:color="CCCCCC" w:sz="4"/>
+            </w:tcBorders>
+            <w:tcMar>
+              <w:top w:type="dxa" w:w="100"/>
+              <w:left w:type="dxa" w:w="120"/>
+              <w:bottom w:type="dxa" w:w="100"/>
+              <w:right w:type="dxa" w:w="120"/>
+            </w:tcMar>
+            <w:vAlign w:val="center"/>
+          </w:tcPr>
+          <w:p>
+            <w:pPr>
+              <w:jc w:val="left"/>
+            </w:pPr>
+            <w:r>
+              <w:rPr>
+                <w:b/>
+                <w:bCs/>
+                <w:i w:val="false"/>
+                <w:iCs w:val="false"/>
+                <w:sz w:val="19"/>
+                <w:szCs w:val="19"/>
+              </w:rPr>
+              <w:t xml:space="preserve">Upsell Score</w:t>
+            </w:r>
+          </w:p>
+        </w:tc>
+        <w:tc>
+          <w:tcPr>
+            <w:tcW w:type="dxa" w:w="1500"/>
+            <w:tcBorders>
+              <w:top w:val="single" w:color="CCCCCC" w:sz="4"/>
+              <w:left w:val="single" w:color="CCCCCC" w:sz="4"/>
+              <w:bottom w:val="single" w:color="CCCCCC" w:sz="4"/>
+              <w:right w:val="single" w:color="CCCCCC" w:sz="4"/>
+            </w:tcBorders>
+            <w:tcMar>
+              <w:top w:type="dxa" w:w="100"/>
+              <w:left w:type="dxa" w:w="120"/>
+              <w:bottom w:type="dxa" w:w="100"/>
+              <w:right w:type="dxa" w:w="120"/>
+            </w:tcMar>
+            <w:vAlign w:val="center"/>
+          </w:tcPr>
+          <w:p>
+            <w:pPr>
+              <w:jc w:val="left"/>
+            </w:pPr>
+            <w:r>
+              <w:rPr>
+                <w:b w:val="false"/>
+                <w:bCs w:val="false"/>
+                <w:i w:val="false"/>
+                <w:iCs w:val="false"/>
+                <w:color w:val="4A6A8A"/>
+                <w:sz w:val="19"/>
+                <w:szCs w:val="19"/>
+              </w:rPr>
+              <w:t xml:space="preserve">Indicador</w:t>
+            </w:r>
+          </w:p>
+        </w:tc>
+        <w:tc>
+          <w:tcPr>
+            <w:tcW w:type="dxa" w:w="5760"/>
+            <w:tcBorders>
+              <w:top w:val="single" w:color="CCCCCC" w:sz="4"/>
+              <w:left w:val="single" w:color="CCCCCC" w:sz="4"/>
+              <w:bottom w:val="single" w:color="CCCCCC" w:sz="4"/>
+              <w:right w:val="single" w:color="CCCCCC" w:sz="4"/>
+            </w:tcBorders>
+            <w:tcMar>
+              <w:top w:type="dxa" w:w="100"/>
+              <w:left w:type="dxa" w:w="120"/>
+              <w:bottom w:type="dxa" w:w="100"/>
+              <w:right w:type="dxa" w:w="120"/>
+            </w:tcMar>
+            <w:vAlign w:val="center"/>
+          </w:tcPr>
+          <w:p>
+            <w:pPr>
+              <w:jc w:val="left"/>
+            </w:pPr>
+            <w:r>
+              <w:rPr>
+                <w:b w:val="false"/>
+                <w:bCs w:val="false"/>
+                <w:i w:val="false"/>
+                <w:iCs w:val="false"/>
+                <w:sz w:val="19"/>
+                <w:szCs w:val="19"/>
+              </w:rPr>
+              <w:t xml:space="preserve">Score 0–100 de propensão a upgrade: utilização + volume acima da média + D/U ratio + ARPU relativo.</w:t>
+            </w:r>
+          </w:p>
+        </w:tc>
+      </w:tr>
+      <w:tr>
+        <w:tc>
+          <w:tcPr>
+            <w:tcW w:type="dxa" w:w="2100"/>
+            <w:tcBorders>
+              <w:top w:val="single" w:color="CCCCCC" w:sz="4"/>
+              <w:left w:val="single" w:color="CCCCCC" w:sz="4"/>
+              <w:bottom w:val="single" w:color="CCCCCC" w:sz="4"/>
+              <w:right w:val="single" w:color="CCCCCC" w:sz="4"/>
+            </w:tcBorders>
+            <w:tcMar>
+              <w:top w:type="dxa" w:w="100"/>
+              <w:left w:type="dxa" w:w="120"/>
+              <w:bottom w:type="dxa" w:w="100"/>
+              <w:right w:type="dxa" w:w="120"/>
+            </w:tcMar>
+            <w:vAlign w:val="center"/>
+          </w:tcPr>
+          <w:p>
+            <w:pPr>
+              <w:jc w:val="left"/>
+            </w:pPr>
+            <w:r>
+              <w:rPr>
+                <w:b/>
+                <w:bCs/>
+                <w:i w:val="false"/>
+                <w:iCs w:val="false"/>
+                <w:sz w:val="19"/>
+                <w:szCs w:val="19"/>
+              </w:rPr>
+              <w:t xml:space="preserve">VAMPING</w:t>
+            </w:r>
+          </w:p>
+        </w:tc>
+        <w:tc>
+          <w:tcPr>
+            <w:tcW w:type="dxa" w:w="1500"/>
+            <w:tcBorders>
+              <w:top w:val="single" w:color="CCCCCC" w:sz="4"/>
+              <w:left w:val="single" w:color="CCCCCC" w:sz="4"/>
+              <w:bottom w:val="single" w:color="CCCCCC" w:sz="4"/>
+              <w:right w:val="single" w:color="CCCCCC" w:sz="4"/>
+            </w:tcBorders>
+            <w:tcMar>
+              <w:top w:type="dxa" w:w="100"/>
+              <w:left w:type="dxa" w:w="120"/>
+              <w:bottom w:type="dxa" w:w="100"/>
+              <w:right w:type="dxa" w:w="120"/>
+            </w:tcMar>
+            <w:vAlign w:val="center"/>
+          </w:tcPr>
+          <w:p>
+            <w:pPr>
+              <w:jc w:val="left"/>
+            </w:pPr>
+            <w:r>
+              <w:rPr>
+                <w:b w:val="false"/>
+                <w:bCs w:val="false"/>
+                <w:i w:val="false"/>
+                <w:iCs w:val="false"/>
+                <w:color w:val="4A6A8A"/>
+                <w:sz w:val="19"/>
+                <w:szCs w:val="19"/>
+              </w:rPr>
+              <w:t xml:space="preserve">Indicador</w:t>
+            </w:r>
+          </w:p>
+        </w:tc>
+        <w:tc>
+          <w:tcPr>
+            <w:tcW w:type="dxa" w:w="5760"/>
+            <w:tcBorders>
+              <w:top w:val="single" w:color="CCCCCC" w:sz="4"/>
+              <w:left w:val="single" w:color="CCCCCC" w:sz="4"/>
+              <w:bottom w:val="single" w:color="CCCCCC" w:sz="4"/>
+              <w:right w:val="single" w:color="CCCCCC" w:sz="4"/>
+            </w:tcBorders>
+            <w:tcMar>
+              <w:top w:type="dxa" w:w="100"/>
+              <w:left w:type="dxa" w:w="120"/>
+              <w:bottom w:type="dxa" w:w="100"/>
+              <w:right w:type="dxa" w:w="120"/>
+            </w:tcMar>
+            <w:vAlign w:val="center"/>
+          </w:tcPr>
+          <w:p>
+            <w:pPr>
+              <w:jc w:val="left"/>
+            </w:pPr>
+            <w:r>
+              <w:rPr>
+                <w:b w:val="false"/>
+                <w:bCs w:val="false"/>
+                <w:i w:val="false"/>
+                <w:iCs w:val="false"/>
+                <w:sz w:val="19"/>
+                <w:szCs w:val="19"/>
+              </w:rPr>
+              <w:t xml:space="preserve">Intensidade de uso noturno crítico (22h–6h): 60% tráfego noturno + 40% % entretenimento/social no período.</w:t>
+            </w:r>
+          </w:p>
+        </w:tc>
+      </w:tr>
+      <w:tr>
+        <w:tc>
+          <w:tcPr>
+            <w:tcW w:type="dxa" w:w="2100"/>
+            <w:tcBorders>
+              <w:top w:val="single" w:color="CCCCCC" w:sz="4"/>
+              <w:left w:val="single" w:color="CCCCCC" w:sz="4"/>
+              <w:bottom w:val="single" w:color="CCCCCC" w:sz="4"/>
+              <w:right w:val="single" w:color="CCCCCC" w:sz="4"/>
+            </w:tcBorders>
+            <w:tcMar>
+              <w:top w:type="dxa" w:w="100"/>
+              <w:left w:type="dxa" w:w="120"/>
+              <w:bottom w:type="dxa" w:w="100"/>
+              <w:right w:type="dxa" w:w="120"/>
+            </w:tcMar>
+            <w:vAlign w:val="center"/>
+          </w:tcPr>
+          <w:p>
+            <w:pPr>
+              <w:jc w:val="left"/>
+            </w:pPr>
+            <w:r>
+              <w:rPr>
+                <w:b/>
+                <w:bCs/>
+                <w:i w:val="false"/>
+                <w:iCs w:val="false"/>
+                <w:sz w:val="19"/>
+                <w:szCs w:val="19"/>
+              </w:rPr>
+              <w:t xml:space="preserve">Verificação Compulsiva</w:t>
+            </w:r>
+          </w:p>
+        </w:tc>
+        <w:tc>
+          <w:tcPr>
+            <w:tcW w:type="dxa" w:w="1500"/>
+            <w:tcBorders>
+              <w:top w:val="single" w:color="CCCCCC" w:sz="4"/>
+              <w:left w:val="single" w:color="CCCCCC" w:sz="4"/>
+              <w:bottom w:val="single" w:color="CCCCCC" w:sz="4"/>
+              <w:right w:val="single" w:color="CCCCCC" w:sz="4"/>
+            </w:tcBorders>
+            <w:tcMar>
+              <w:top w:type="dxa" w:w="100"/>
+              <w:left w:type="dxa" w:w="120"/>
+              <w:bottom w:type="dxa" w:w="100"/>
+              <w:right w:type="dxa" w:w="120"/>
+            </w:tcMar>
+            <w:vAlign w:val="center"/>
+          </w:tcPr>
+          <w:p>
+            <w:pPr>
+              <w:jc w:val="left"/>
+            </w:pPr>
+            <w:r>
+              <w:rPr>
+                <w:b w:val="false"/>
+                <w:bCs w:val="false"/>
+                <w:i w:val="false"/>
+                <w:iCs w:val="false"/>
+                <w:color w:val="4A6A8A"/>
+                <w:sz w:val="19"/>
+                <w:szCs w:val="19"/>
+              </w:rPr>
+              <w:t xml:space="preserve">Indicador</w:t>
+            </w:r>
+          </w:p>
+        </w:tc>
+        <w:tc>
+          <w:tcPr>
+            <w:tcW w:type="dxa" w:w="5760"/>
+            <w:tcBorders>
+              <w:top w:val="single" w:color="CCCCCC" w:sz="4"/>
+              <w:left w:val="single" w:color="CCCCCC" w:sz="4"/>
+              <w:bottom w:val="single" w:color="CCCCCC" w:sz="4"/>
+              <w:right w:val="single" w:color="CCCCCC" w:sz="4"/>
+            </w:tcBorders>
+            <w:tcMar>
+              <w:top w:type="dxa" w:w="100"/>
+              <w:left w:type="dxa" w:w="120"/>
+              <w:bottom w:type="dxa" w:w="100"/>
+              <w:right w:type="dxa" w:w="120"/>
+            </w:tcMar>
+            <w:vAlign w:val="center"/>
+          </w:tcPr>
+          <w:p>
+            <w:pPr>
+              <w:jc w:val="left"/>
+            </w:pPr>
+            <w:r>
+              <w:rPr>
+                <w:b w:val="false"/>
+                <w:bCs w:val="false"/>
+                <w:i w:val="false"/>
+                <w:iCs w:val="false"/>
+                <w:sz w:val="19"/>
+                <w:szCs w:val="19"/>
+              </w:rPr>
+              <w:t xml:space="preserve">Aproximação de burstiness de checagem: 60% frequência de sessões/dia + 40% brevidade, normalizados por percentil.</w:t>
+            </w:r>
+          </w:p>
+        </w:tc>
+      </w:tr>
+    </w:tbl>
+    <w:p>
+      <w:pPr>
+        <w:spacing w:after="0" w:before="0"/>
+        <w:jc w:val="both"/>
+      </w:pPr>
+      <w:r>
+        <w:rPr>
+          <w:b w:val="false"/>
+          <w:bCs w:val="false"/>
+          <w:i w:val="false"/>
+          <w:iCs w:val="false"/>
+        </w:rPr>
+        <w:t xml:space="preserve">Termos institucionais recorrentes em toda a série de documentos da Lounge de Soluções ISP (RAG, SLM, LGPD, ITU-T, TM Forum, eTOM) seguem a mesma definição em todos os Product Reports desta série, por força do padrão de documentação da Vísent (docs/PADRAO_DOCUMENTACAO_PRODUTO.md).</w:t>
+      </w:r>
+    </w:p>
     <w:sectPr>
       <w:headerReference w:type="default" r:id="rId9"/>
       <w:footerReference w:type="default" r:id="rId10"/>

</xml_diff>